<commit_message>
bug fixes, visual polish, admin panel
</commit_message>
<xml_diff>
--- a/VitaminE_Wiki.docx
+++ b/VitaminE_Wiki.docx
@@ -232,11 +232,7 @@
           </w:pPr>
           <w:r>
             <w:fldChar w:fldCharType="begin"/>
-          </w:r>
-          <w:r>
             <w:instrText>TOC \h \o "1-3"</w:instrText>
-          </w:r>
-          <w:r>
             <w:fldChar w:fldCharType="separate"/>
           </w:r>
           <w:hyperlink w:anchor="_Toc233316878" w:history="1">
@@ -252,40 +248,10 @@
                 <w:noProof/>
               </w:rPr>
               <w:tab/>
-            </w:r>
-            <w:r>
-              <w:rPr>
-                <w:noProof/>
-              </w:rPr>
               <w:fldChar w:fldCharType="begin"/>
-            </w:r>
-            <w:r>
-              <w:rPr>
-                <w:noProof/>
-              </w:rPr>
               <w:instrText xml:space="preserve"> PAGEREF _Toc233316878 \h </w:instrText>
-            </w:r>
-            <w:r>
-              <w:rPr>
-                <w:noProof/>
-              </w:rPr>
-            </w:r>
-            <w:r>
-              <w:rPr>
-                <w:noProof/>
-              </w:rPr>
               <w:fldChar w:fldCharType="separate"/>
-            </w:r>
-            <w:r>
-              <w:rPr>
-                <w:noProof/>
-              </w:rPr>
               <w:t>2</w:t>
-            </w:r>
-            <w:r>
-              <w:rPr>
-                <w:noProof/>
-              </w:rPr>
               <w:fldChar w:fldCharType="end"/>
             </w:r>
           </w:hyperlink>
@@ -313,40 +279,10 @@
                 <w:noProof/>
               </w:rPr>
               <w:tab/>
-            </w:r>
-            <w:r>
-              <w:rPr>
-                <w:noProof/>
-              </w:rPr>
               <w:fldChar w:fldCharType="begin"/>
-            </w:r>
-            <w:r>
-              <w:rPr>
-                <w:noProof/>
-              </w:rPr>
               <w:instrText xml:space="preserve"> PAGEREF _Toc233316879 \h </w:instrText>
-            </w:r>
-            <w:r>
-              <w:rPr>
-                <w:noProof/>
-              </w:rPr>
-            </w:r>
-            <w:r>
-              <w:rPr>
-                <w:noProof/>
-              </w:rPr>
               <w:fldChar w:fldCharType="separate"/>
-            </w:r>
-            <w:r>
-              <w:rPr>
-                <w:noProof/>
-              </w:rPr>
               <w:t>5</w:t>
-            </w:r>
-            <w:r>
-              <w:rPr>
-                <w:noProof/>
-              </w:rPr>
               <w:fldChar w:fldCharType="end"/>
             </w:r>
           </w:hyperlink>
@@ -374,40 +310,10 @@
                 <w:noProof/>
               </w:rPr>
               <w:tab/>
-            </w:r>
-            <w:r>
-              <w:rPr>
-                <w:noProof/>
-              </w:rPr>
               <w:fldChar w:fldCharType="begin"/>
-            </w:r>
-            <w:r>
-              <w:rPr>
-                <w:noProof/>
-              </w:rPr>
               <w:instrText xml:space="preserve"> PAGEREF _Toc233316880 \h </w:instrText>
-            </w:r>
-            <w:r>
-              <w:rPr>
-                <w:noProof/>
-              </w:rPr>
-            </w:r>
-            <w:r>
-              <w:rPr>
-                <w:noProof/>
-              </w:rPr>
               <w:fldChar w:fldCharType="separate"/>
-            </w:r>
-            <w:r>
-              <w:rPr>
-                <w:noProof/>
-              </w:rPr>
               <w:t>5</w:t>
-            </w:r>
-            <w:r>
-              <w:rPr>
-                <w:noProof/>
-              </w:rPr>
               <w:fldChar w:fldCharType="end"/>
             </w:r>
           </w:hyperlink>
@@ -435,40 +341,10 @@
                 <w:noProof/>
               </w:rPr>
               <w:tab/>
-            </w:r>
-            <w:r>
-              <w:rPr>
-                <w:noProof/>
-              </w:rPr>
               <w:fldChar w:fldCharType="begin"/>
-            </w:r>
-            <w:r>
-              <w:rPr>
-                <w:noProof/>
-              </w:rPr>
               <w:instrText xml:space="preserve"> PAGEREF _Toc233316881 \h </w:instrText>
-            </w:r>
-            <w:r>
-              <w:rPr>
-                <w:noProof/>
-              </w:rPr>
-            </w:r>
-            <w:r>
-              <w:rPr>
-                <w:noProof/>
-              </w:rPr>
               <w:fldChar w:fldCharType="separate"/>
-            </w:r>
-            <w:r>
-              <w:rPr>
-                <w:noProof/>
-              </w:rPr>
               <w:t>5</w:t>
-            </w:r>
-            <w:r>
-              <w:rPr>
-                <w:noProof/>
-              </w:rPr>
               <w:fldChar w:fldCharType="end"/>
             </w:r>
           </w:hyperlink>
@@ -496,40 +372,10 @@
                 <w:noProof/>
               </w:rPr>
               <w:tab/>
-            </w:r>
-            <w:r>
-              <w:rPr>
-                <w:noProof/>
-              </w:rPr>
               <w:fldChar w:fldCharType="begin"/>
-            </w:r>
-            <w:r>
-              <w:rPr>
-                <w:noProof/>
-              </w:rPr>
               <w:instrText xml:space="preserve"> PAGEREF _Toc233316882 \h </w:instrText>
-            </w:r>
-            <w:r>
-              <w:rPr>
-                <w:noProof/>
-              </w:rPr>
-            </w:r>
-            <w:r>
-              <w:rPr>
-                <w:noProof/>
-              </w:rPr>
               <w:fldChar w:fldCharType="separate"/>
-            </w:r>
-            <w:r>
-              <w:rPr>
-                <w:noProof/>
-              </w:rPr>
               <w:t>5</w:t>
-            </w:r>
-            <w:r>
-              <w:rPr>
-                <w:noProof/>
-              </w:rPr>
               <w:fldChar w:fldCharType="end"/>
             </w:r>
           </w:hyperlink>
@@ -557,40 +403,10 @@
                 <w:noProof/>
               </w:rPr>
               <w:tab/>
-            </w:r>
-            <w:r>
-              <w:rPr>
-                <w:noProof/>
-              </w:rPr>
               <w:fldChar w:fldCharType="begin"/>
-            </w:r>
-            <w:r>
-              <w:rPr>
-                <w:noProof/>
-              </w:rPr>
               <w:instrText xml:space="preserve"> PAGEREF _Toc233316883 \h </w:instrText>
-            </w:r>
-            <w:r>
-              <w:rPr>
-                <w:noProof/>
-              </w:rPr>
-            </w:r>
-            <w:r>
-              <w:rPr>
-                <w:noProof/>
-              </w:rPr>
               <w:fldChar w:fldCharType="separate"/>
-            </w:r>
-            <w:r>
-              <w:rPr>
-                <w:noProof/>
-              </w:rPr>
               <w:t>5</w:t>
-            </w:r>
-            <w:r>
-              <w:rPr>
-                <w:noProof/>
-              </w:rPr>
               <w:fldChar w:fldCharType="end"/>
             </w:r>
           </w:hyperlink>
@@ -618,40 +434,10 @@
                 <w:noProof/>
               </w:rPr>
               <w:tab/>
-            </w:r>
-            <w:r>
-              <w:rPr>
-                <w:noProof/>
-              </w:rPr>
               <w:fldChar w:fldCharType="begin"/>
-            </w:r>
-            <w:r>
-              <w:rPr>
-                <w:noProof/>
-              </w:rPr>
               <w:instrText xml:space="preserve"> PAGEREF _Toc233316884 \h </w:instrText>
-            </w:r>
-            <w:r>
-              <w:rPr>
-                <w:noProof/>
-              </w:rPr>
-            </w:r>
-            <w:r>
-              <w:rPr>
-                <w:noProof/>
-              </w:rPr>
               <w:fldChar w:fldCharType="separate"/>
-            </w:r>
-            <w:r>
-              <w:rPr>
-                <w:noProof/>
-              </w:rPr>
               <w:t>7</w:t>
-            </w:r>
-            <w:r>
-              <w:rPr>
-                <w:noProof/>
-              </w:rPr>
               <w:fldChar w:fldCharType="end"/>
             </w:r>
           </w:hyperlink>
@@ -679,40 +465,10 @@
                 <w:noProof/>
               </w:rPr>
               <w:tab/>
-            </w:r>
-            <w:r>
-              <w:rPr>
-                <w:noProof/>
-              </w:rPr>
               <w:fldChar w:fldCharType="begin"/>
-            </w:r>
-            <w:r>
-              <w:rPr>
-                <w:noProof/>
-              </w:rPr>
               <w:instrText xml:space="preserve"> PAGEREF _Toc233316885 \h </w:instrText>
-            </w:r>
-            <w:r>
-              <w:rPr>
-                <w:noProof/>
-              </w:rPr>
-            </w:r>
-            <w:r>
-              <w:rPr>
-                <w:noProof/>
-              </w:rPr>
               <w:fldChar w:fldCharType="separate"/>
-            </w:r>
-            <w:r>
-              <w:rPr>
-                <w:noProof/>
-              </w:rPr>
               <w:t>7</w:t>
-            </w:r>
-            <w:r>
-              <w:rPr>
-                <w:noProof/>
-              </w:rPr>
               <w:fldChar w:fldCharType="end"/>
             </w:r>
           </w:hyperlink>
@@ -740,40 +496,10 @@
                 <w:noProof/>
               </w:rPr>
               <w:tab/>
-            </w:r>
-            <w:r>
-              <w:rPr>
-                <w:noProof/>
-              </w:rPr>
               <w:fldChar w:fldCharType="begin"/>
-            </w:r>
-            <w:r>
-              <w:rPr>
-                <w:noProof/>
-              </w:rPr>
               <w:instrText xml:space="preserve"> PAGEREF _Toc233316886 \h </w:instrText>
-            </w:r>
-            <w:r>
-              <w:rPr>
-                <w:noProof/>
-              </w:rPr>
-            </w:r>
-            <w:r>
-              <w:rPr>
-                <w:noProof/>
-              </w:rPr>
               <w:fldChar w:fldCharType="separate"/>
-            </w:r>
-            <w:r>
-              <w:rPr>
-                <w:noProof/>
-              </w:rPr>
               <w:t>7</w:t>
-            </w:r>
-            <w:r>
-              <w:rPr>
-                <w:noProof/>
-              </w:rPr>
               <w:fldChar w:fldCharType="end"/>
             </w:r>
           </w:hyperlink>
@@ -801,40 +527,10 @@
                 <w:noProof/>
               </w:rPr>
               <w:tab/>
-            </w:r>
-            <w:r>
-              <w:rPr>
-                <w:noProof/>
-              </w:rPr>
               <w:fldChar w:fldCharType="begin"/>
-            </w:r>
-            <w:r>
-              <w:rPr>
-                <w:noProof/>
-              </w:rPr>
               <w:instrText xml:space="preserve"> PAGEREF _Toc233316887 \h </w:instrText>
-            </w:r>
-            <w:r>
-              <w:rPr>
-                <w:noProof/>
-              </w:rPr>
-            </w:r>
-            <w:r>
-              <w:rPr>
-                <w:noProof/>
-              </w:rPr>
               <w:fldChar w:fldCharType="separate"/>
-            </w:r>
-            <w:r>
-              <w:rPr>
-                <w:noProof/>
-              </w:rPr>
               <w:t>7</w:t>
-            </w:r>
-            <w:r>
-              <w:rPr>
-                <w:noProof/>
-              </w:rPr>
               <w:fldChar w:fldCharType="end"/>
             </w:r>
           </w:hyperlink>
@@ -862,40 +558,10 @@
                 <w:noProof/>
               </w:rPr>
               <w:tab/>
-            </w:r>
-            <w:r>
-              <w:rPr>
-                <w:noProof/>
-              </w:rPr>
               <w:fldChar w:fldCharType="begin"/>
-            </w:r>
-            <w:r>
-              <w:rPr>
-                <w:noProof/>
-              </w:rPr>
               <w:instrText xml:space="preserve"> PAGEREF _Toc233316888 \h </w:instrText>
-            </w:r>
-            <w:r>
-              <w:rPr>
-                <w:noProof/>
-              </w:rPr>
-            </w:r>
-            <w:r>
-              <w:rPr>
-                <w:noProof/>
-              </w:rPr>
               <w:fldChar w:fldCharType="separate"/>
-            </w:r>
-            <w:r>
-              <w:rPr>
-                <w:noProof/>
-              </w:rPr>
               <w:t>8</w:t>
-            </w:r>
-            <w:r>
-              <w:rPr>
-                <w:noProof/>
-              </w:rPr>
               <w:fldChar w:fldCharType="end"/>
             </w:r>
           </w:hyperlink>
@@ -923,40 +589,10 @@
                 <w:noProof/>
               </w:rPr>
               <w:tab/>
-            </w:r>
-            <w:r>
-              <w:rPr>
-                <w:noProof/>
-              </w:rPr>
               <w:fldChar w:fldCharType="begin"/>
-            </w:r>
-            <w:r>
-              <w:rPr>
-                <w:noProof/>
-              </w:rPr>
               <w:instrText xml:space="preserve"> PAGEREF _Toc233316889 \h </w:instrText>
-            </w:r>
-            <w:r>
-              <w:rPr>
-                <w:noProof/>
-              </w:rPr>
-            </w:r>
-            <w:r>
-              <w:rPr>
-                <w:noProof/>
-              </w:rPr>
               <w:fldChar w:fldCharType="separate"/>
-            </w:r>
-            <w:r>
-              <w:rPr>
-                <w:noProof/>
-              </w:rPr>
               <w:t>8</w:t>
-            </w:r>
-            <w:r>
-              <w:rPr>
-                <w:noProof/>
-              </w:rPr>
               <w:fldChar w:fldCharType="end"/>
             </w:r>
           </w:hyperlink>
@@ -984,40 +620,10 @@
                 <w:noProof/>
               </w:rPr>
               <w:tab/>
-            </w:r>
-            <w:r>
-              <w:rPr>
-                <w:noProof/>
-              </w:rPr>
               <w:fldChar w:fldCharType="begin"/>
-            </w:r>
-            <w:r>
-              <w:rPr>
-                <w:noProof/>
-              </w:rPr>
               <w:instrText xml:space="preserve"> PAGEREF _Toc233316890 \h </w:instrText>
-            </w:r>
-            <w:r>
-              <w:rPr>
-                <w:noProof/>
-              </w:rPr>
-            </w:r>
-            <w:r>
-              <w:rPr>
-                <w:noProof/>
-              </w:rPr>
               <w:fldChar w:fldCharType="separate"/>
-            </w:r>
-            <w:r>
-              <w:rPr>
-                <w:noProof/>
-              </w:rPr>
               <w:t>9</w:t>
-            </w:r>
-            <w:r>
-              <w:rPr>
-                <w:noProof/>
-              </w:rPr>
               <w:fldChar w:fldCharType="end"/>
             </w:r>
           </w:hyperlink>
@@ -1045,40 +651,10 @@
                 <w:noProof/>
               </w:rPr>
               <w:tab/>
-            </w:r>
-            <w:r>
-              <w:rPr>
-                <w:noProof/>
-              </w:rPr>
               <w:fldChar w:fldCharType="begin"/>
-            </w:r>
-            <w:r>
-              <w:rPr>
-                <w:noProof/>
-              </w:rPr>
               <w:instrText xml:space="preserve"> PAGEREF _Toc233316891 \h </w:instrText>
-            </w:r>
-            <w:r>
-              <w:rPr>
-                <w:noProof/>
-              </w:rPr>
-            </w:r>
-            <w:r>
-              <w:rPr>
-                <w:noProof/>
-              </w:rPr>
               <w:fldChar w:fldCharType="separate"/>
-            </w:r>
-            <w:r>
-              <w:rPr>
-                <w:noProof/>
-              </w:rPr>
               <w:t>9</w:t>
-            </w:r>
-            <w:r>
-              <w:rPr>
-                <w:noProof/>
-              </w:rPr>
               <w:fldChar w:fldCharType="end"/>
             </w:r>
           </w:hyperlink>
@@ -1106,40 +682,10 @@
                 <w:noProof/>
               </w:rPr>
               <w:tab/>
-            </w:r>
-            <w:r>
-              <w:rPr>
-                <w:noProof/>
-              </w:rPr>
               <w:fldChar w:fldCharType="begin"/>
-            </w:r>
-            <w:r>
-              <w:rPr>
-                <w:noProof/>
-              </w:rPr>
               <w:instrText xml:space="preserve"> PAGEREF _Toc233316892 \h </w:instrText>
-            </w:r>
-            <w:r>
-              <w:rPr>
-                <w:noProof/>
-              </w:rPr>
-            </w:r>
-            <w:r>
-              <w:rPr>
-                <w:noProof/>
-              </w:rPr>
               <w:fldChar w:fldCharType="separate"/>
-            </w:r>
-            <w:r>
-              <w:rPr>
-                <w:noProof/>
-              </w:rPr>
               <w:t>9</w:t>
-            </w:r>
-            <w:r>
-              <w:rPr>
-                <w:noProof/>
-              </w:rPr>
               <w:fldChar w:fldCharType="end"/>
             </w:r>
           </w:hyperlink>
@@ -1167,40 +713,10 @@
                 <w:noProof/>
               </w:rPr>
               <w:tab/>
-            </w:r>
-            <w:r>
-              <w:rPr>
-                <w:noProof/>
-              </w:rPr>
               <w:fldChar w:fldCharType="begin"/>
-            </w:r>
-            <w:r>
-              <w:rPr>
-                <w:noProof/>
-              </w:rPr>
               <w:instrText xml:space="preserve"> PAGEREF _Toc233316893 \h </w:instrText>
-            </w:r>
-            <w:r>
-              <w:rPr>
-                <w:noProof/>
-              </w:rPr>
-            </w:r>
-            <w:r>
-              <w:rPr>
-                <w:noProof/>
-              </w:rPr>
               <w:fldChar w:fldCharType="separate"/>
-            </w:r>
-            <w:r>
-              <w:rPr>
-                <w:noProof/>
-              </w:rPr>
               <w:t>9</w:t>
-            </w:r>
-            <w:r>
-              <w:rPr>
-                <w:noProof/>
-              </w:rPr>
               <w:fldChar w:fldCharType="end"/>
             </w:r>
           </w:hyperlink>
@@ -1228,40 +744,10 @@
                 <w:noProof/>
               </w:rPr>
               <w:tab/>
-            </w:r>
-            <w:r>
-              <w:rPr>
-                <w:noProof/>
-              </w:rPr>
               <w:fldChar w:fldCharType="begin"/>
-            </w:r>
-            <w:r>
-              <w:rPr>
-                <w:noProof/>
-              </w:rPr>
               <w:instrText xml:space="preserve"> PAGEREF _Toc233316894 \h </w:instrText>
-            </w:r>
-            <w:r>
-              <w:rPr>
-                <w:noProof/>
-              </w:rPr>
-            </w:r>
-            <w:r>
-              <w:rPr>
-                <w:noProof/>
-              </w:rPr>
               <w:fldChar w:fldCharType="separate"/>
-            </w:r>
-            <w:r>
-              <w:rPr>
-                <w:noProof/>
-              </w:rPr>
               <w:t>9</w:t>
-            </w:r>
-            <w:r>
-              <w:rPr>
-                <w:noProof/>
-              </w:rPr>
               <w:fldChar w:fldCharType="end"/>
             </w:r>
           </w:hyperlink>
@@ -1289,40 +775,10 @@
                 <w:noProof/>
               </w:rPr>
               <w:tab/>
-            </w:r>
-            <w:r>
-              <w:rPr>
-                <w:noProof/>
-              </w:rPr>
               <w:fldChar w:fldCharType="begin"/>
-            </w:r>
-            <w:r>
-              <w:rPr>
-                <w:noProof/>
-              </w:rPr>
               <w:instrText xml:space="preserve"> PAGEREF _Toc233316895 \h </w:instrText>
-            </w:r>
-            <w:r>
-              <w:rPr>
-                <w:noProof/>
-              </w:rPr>
-            </w:r>
-            <w:r>
-              <w:rPr>
-                <w:noProof/>
-              </w:rPr>
               <w:fldChar w:fldCharType="separate"/>
-            </w:r>
-            <w:r>
-              <w:rPr>
-                <w:noProof/>
-              </w:rPr>
               <w:t>10</w:t>
-            </w:r>
-            <w:r>
-              <w:rPr>
-                <w:noProof/>
-              </w:rPr>
               <w:fldChar w:fldCharType="end"/>
             </w:r>
           </w:hyperlink>
@@ -1350,40 +806,10 @@
                 <w:noProof/>
               </w:rPr>
               <w:tab/>
-            </w:r>
-            <w:r>
-              <w:rPr>
-                <w:noProof/>
-              </w:rPr>
               <w:fldChar w:fldCharType="begin"/>
-            </w:r>
-            <w:r>
-              <w:rPr>
-                <w:noProof/>
-              </w:rPr>
               <w:instrText xml:space="preserve"> PAGEREF _Toc233316896 \h </w:instrText>
-            </w:r>
-            <w:r>
-              <w:rPr>
-                <w:noProof/>
-              </w:rPr>
-            </w:r>
-            <w:r>
-              <w:rPr>
-                <w:noProof/>
-              </w:rPr>
               <w:fldChar w:fldCharType="separate"/>
-            </w:r>
-            <w:r>
-              <w:rPr>
-                <w:noProof/>
-              </w:rPr>
               <w:t>10</w:t>
-            </w:r>
-            <w:r>
-              <w:rPr>
-                <w:noProof/>
-              </w:rPr>
               <w:fldChar w:fldCharType="end"/>
             </w:r>
           </w:hyperlink>
@@ -1411,40 +837,10 @@
                 <w:noProof/>
               </w:rPr>
               <w:tab/>
-            </w:r>
-            <w:r>
-              <w:rPr>
-                <w:noProof/>
-              </w:rPr>
               <w:fldChar w:fldCharType="begin"/>
-            </w:r>
-            <w:r>
-              <w:rPr>
-                <w:noProof/>
-              </w:rPr>
               <w:instrText xml:space="preserve"> PAGEREF _Toc233316897 \h </w:instrText>
-            </w:r>
-            <w:r>
-              <w:rPr>
-                <w:noProof/>
-              </w:rPr>
-            </w:r>
-            <w:r>
-              <w:rPr>
-                <w:noProof/>
-              </w:rPr>
               <w:fldChar w:fldCharType="separate"/>
-            </w:r>
-            <w:r>
-              <w:rPr>
-                <w:noProof/>
-              </w:rPr>
               <w:t>10</w:t>
-            </w:r>
-            <w:r>
-              <w:rPr>
-                <w:noProof/>
-              </w:rPr>
               <w:fldChar w:fldCharType="end"/>
             </w:r>
           </w:hyperlink>
@@ -1472,40 +868,10 @@
                 <w:noProof/>
               </w:rPr>
               <w:tab/>
-            </w:r>
-            <w:r>
-              <w:rPr>
-                <w:noProof/>
-              </w:rPr>
               <w:fldChar w:fldCharType="begin"/>
-            </w:r>
-            <w:r>
-              <w:rPr>
-                <w:noProof/>
-              </w:rPr>
               <w:instrText xml:space="preserve"> PAGEREF _Toc233316898 \h </w:instrText>
-            </w:r>
-            <w:r>
-              <w:rPr>
-                <w:noProof/>
-              </w:rPr>
-            </w:r>
-            <w:r>
-              <w:rPr>
-                <w:noProof/>
-              </w:rPr>
               <w:fldChar w:fldCharType="separate"/>
-            </w:r>
-            <w:r>
-              <w:rPr>
-                <w:noProof/>
-              </w:rPr>
               <w:t>11</w:t>
-            </w:r>
-            <w:r>
-              <w:rPr>
-                <w:noProof/>
-              </w:rPr>
               <w:fldChar w:fldCharType="end"/>
             </w:r>
           </w:hyperlink>
@@ -1533,40 +899,10 @@
                 <w:noProof/>
               </w:rPr>
               <w:tab/>
-            </w:r>
-            <w:r>
-              <w:rPr>
-                <w:noProof/>
-              </w:rPr>
               <w:fldChar w:fldCharType="begin"/>
-            </w:r>
-            <w:r>
-              <w:rPr>
-                <w:noProof/>
-              </w:rPr>
               <w:instrText xml:space="preserve"> PAGEREF _Toc233316899 \h </w:instrText>
-            </w:r>
-            <w:r>
-              <w:rPr>
-                <w:noProof/>
-              </w:rPr>
-            </w:r>
-            <w:r>
-              <w:rPr>
-                <w:noProof/>
-              </w:rPr>
               <w:fldChar w:fldCharType="separate"/>
-            </w:r>
-            <w:r>
-              <w:rPr>
-                <w:noProof/>
-              </w:rPr>
               <w:t>11</w:t>
-            </w:r>
-            <w:r>
-              <w:rPr>
-                <w:noProof/>
-              </w:rPr>
               <w:fldChar w:fldCharType="end"/>
             </w:r>
           </w:hyperlink>
@@ -1594,40 +930,10 @@
                 <w:noProof/>
               </w:rPr>
               <w:tab/>
-            </w:r>
-            <w:r>
-              <w:rPr>
-                <w:noProof/>
-              </w:rPr>
               <w:fldChar w:fldCharType="begin"/>
-            </w:r>
-            <w:r>
-              <w:rPr>
-                <w:noProof/>
-              </w:rPr>
               <w:instrText xml:space="preserve"> PAGEREF _Toc233316900 \h </w:instrText>
-            </w:r>
-            <w:r>
-              <w:rPr>
-                <w:noProof/>
-              </w:rPr>
-            </w:r>
-            <w:r>
-              <w:rPr>
-                <w:noProof/>
-              </w:rPr>
               <w:fldChar w:fldCharType="separate"/>
-            </w:r>
-            <w:r>
-              <w:rPr>
-                <w:noProof/>
-              </w:rPr>
               <w:t>11</w:t>
-            </w:r>
-            <w:r>
-              <w:rPr>
-                <w:noProof/>
-              </w:rPr>
               <w:fldChar w:fldCharType="end"/>
             </w:r>
           </w:hyperlink>
@@ -1655,40 +961,10 @@
                 <w:noProof/>
               </w:rPr>
               <w:tab/>
-            </w:r>
-            <w:r>
-              <w:rPr>
-                <w:noProof/>
-              </w:rPr>
               <w:fldChar w:fldCharType="begin"/>
-            </w:r>
-            <w:r>
-              <w:rPr>
-                <w:noProof/>
-              </w:rPr>
               <w:instrText xml:space="preserve"> PAGEREF _Toc233316901 \h </w:instrText>
-            </w:r>
-            <w:r>
-              <w:rPr>
-                <w:noProof/>
-              </w:rPr>
-            </w:r>
-            <w:r>
-              <w:rPr>
-                <w:noProof/>
-              </w:rPr>
               <w:fldChar w:fldCharType="separate"/>
-            </w:r>
-            <w:r>
-              <w:rPr>
-                <w:noProof/>
-              </w:rPr>
               <w:t>11</w:t>
-            </w:r>
-            <w:r>
-              <w:rPr>
-                <w:noProof/>
-              </w:rPr>
               <w:fldChar w:fldCharType="end"/>
             </w:r>
           </w:hyperlink>
@@ -1716,40 +992,10 @@
                 <w:noProof/>
               </w:rPr>
               <w:tab/>
-            </w:r>
-            <w:r>
-              <w:rPr>
-                <w:noProof/>
-              </w:rPr>
               <w:fldChar w:fldCharType="begin"/>
-            </w:r>
-            <w:r>
-              <w:rPr>
-                <w:noProof/>
-              </w:rPr>
               <w:instrText xml:space="preserve"> PAGEREF _Toc233316902 \h </w:instrText>
-            </w:r>
-            <w:r>
-              <w:rPr>
-                <w:noProof/>
-              </w:rPr>
-            </w:r>
-            <w:r>
-              <w:rPr>
-                <w:noProof/>
-              </w:rPr>
               <w:fldChar w:fldCharType="separate"/>
-            </w:r>
-            <w:r>
-              <w:rPr>
-                <w:noProof/>
-              </w:rPr>
               <w:t>13</w:t>
-            </w:r>
-            <w:r>
-              <w:rPr>
-                <w:noProof/>
-              </w:rPr>
               <w:fldChar w:fldCharType="end"/>
             </w:r>
           </w:hyperlink>
@@ -1777,40 +1023,10 @@
                 <w:noProof/>
               </w:rPr>
               <w:tab/>
-            </w:r>
-            <w:r>
-              <w:rPr>
-                <w:noProof/>
-              </w:rPr>
               <w:fldChar w:fldCharType="begin"/>
-            </w:r>
-            <w:r>
-              <w:rPr>
-                <w:noProof/>
-              </w:rPr>
               <w:instrText xml:space="preserve"> PAGEREF _Toc233316903 \h </w:instrText>
-            </w:r>
-            <w:r>
-              <w:rPr>
-                <w:noProof/>
-              </w:rPr>
-            </w:r>
-            <w:r>
-              <w:rPr>
-                <w:noProof/>
-              </w:rPr>
               <w:fldChar w:fldCharType="separate"/>
-            </w:r>
-            <w:r>
-              <w:rPr>
-                <w:noProof/>
-              </w:rPr>
               <w:t>14</w:t>
-            </w:r>
-            <w:r>
-              <w:rPr>
-                <w:noProof/>
-              </w:rPr>
               <w:fldChar w:fldCharType="end"/>
             </w:r>
           </w:hyperlink>
@@ -1838,40 +1054,10 @@
                 <w:noProof/>
               </w:rPr>
               <w:tab/>
-            </w:r>
-            <w:r>
-              <w:rPr>
-                <w:noProof/>
-              </w:rPr>
               <w:fldChar w:fldCharType="begin"/>
-            </w:r>
-            <w:r>
-              <w:rPr>
-                <w:noProof/>
-              </w:rPr>
               <w:instrText xml:space="preserve"> PAGEREF _Toc233316904 \h </w:instrText>
-            </w:r>
-            <w:r>
-              <w:rPr>
-                <w:noProof/>
-              </w:rPr>
-            </w:r>
-            <w:r>
-              <w:rPr>
-                <w:noProof/>
-              </w:rPr>
               <w:fldChar w:fldCharType="separate"/>
-            </w:r>
-            <w:r>
-              <w:rPr>
-                <w:noProof/>
-              </w:rPr>
               <w:t>14</w:t>
-            </w:r>
-            <w:r>
-              <w:rPr>
-                <w:noProof/>
-              </w:rPr>
               <w:fldChar w:fldCharType="end"/>
             </w:r>
           </w:hyperlink>
@@ -1899,40 +1085,10 @@
                 <w:noProof/>
               </w:rPr>
               <w:tab/>
-            </w:r>
-            <w:r>
-              <w:rPr>
-                <w:noProof/>
-              </w:rPr>
               <w:fldChar w:fldCharType="begin"/>
-            </w:r>
-            <w:r>
-              <w:rPr>
-                <w:noProof/>
-              </w:rPr>
               <w:instrText xml:space="preserve"> PAGEREF _Toc233316905 \h </w:instrText>
-            </w:r>
-            <w:r>
-              <w:rPr>
-                <w:noProof/>
-              </w:rPr>
-            </w:r>
-            <w:r>
-              <w:rPr>
-                <w:noProof/>
-              </w:rPr>
               <w:fldChar w:fldCharType="separate"/>
-            </w:r>
-            <w:r>
-              <w:rPr>
-                <w:noProof/>
-              </w:rPr>
               <w:t>14</w:t>
-            </w:r>
-            <w:r>
-              <w:rPr>
-                <w:noProof/>
-              </w:rPr>
               <w:fldChar w:fldCharType="end"/>
             </w:r>
           </w:hyperlink>
@@ -1960,40 +1116,10 @@
                 <w:noProof/>
               </w:rPr>
               <w:tab/>
-            </w:r>
-            <w:r>
-              <w:rPr>
-                <w:noProof/>
-              </w:rPr>
               <w:fldChar w:fldCharType="begin"/>
-            </w:r>
-            <w:r>
-              <w:rPr>
-                <w:noProof/>
-              </w:rPr>
               <w:instrText xml:space="preserve"> PAGEREF _Toc233316906 \h </w:instrText>
-            </w:r>
-            <w:r>
-              <w:rPr>
-                <w:noProof/>
-              </w:rPr>
-            </w:r>
-            <w:r>
-              <w:rPr>
-                <w:noProof/>
-              </w:rPr>
               <w:fldChar w:fldCharType="separate"/>
-            </w:r>
-            <w:r>
-              <w:rPr>
-                <w:noProof/>
-              </w:rPr>
               <w:t>14</w:t>
-            </w:r>
-            <w:r>
-              <w:rPr>
-                <w:noProof/>
-              </w:rPr>
               <w:fldChar w:fldCharType="end"/>
             </w:r>
           </w:hyperlink>
@@ -2021,40 +1147,10 @@
                 <w:noProof/>
               </w:rPr>
               <w:tab/>
-            </w:r>
-            <w:r>
-              <w:rPr>
-                <w:noProof/>
-              </w:rPr>
               <w:fldChar w:fldCharType="begin"/>
-            </w:r>
-            <w:r>
-              <w:rPr>
-                <w:noProof/>
-              </w:rPr>
               <w:instrText xml:space="preserve"> PAGEREF _Toc233316907 \h </w:instrText>
-            </w:r>
-            <w:r>
-              <w:rPr>
-                <w:noProof/>
-              </w:rPr>
-            </w:r>
-            <w:r>
-              <w:rPr>
-                <w:noProof/>
-              </w:rPr>
               <w:fldChar w:fldCharType="separate"/>
-            </w:r>
-            <w:r>
-              <w:rPr>
-                <w:noProof/>
-              </w:rPr>
               <w:t>15</w:t>
-            </w:r>
-            <w:r>
-              <w:rPr>
-                <w:noProof/>
-              </w:rPr>
               <w:fldChar w:fldCharType="end"/>
             </w:r>
           </w:hyperlink>
@@ -2082,40 +1178,10 @@
                 <w:noProof/>
               </w:rPr>
               <w:tab/>
-            </w:r>
-            <w:r>
-              <w:rPr>
-                <w:noProof/>
-              </w:rPr>
               <w:fldChar w:fldCharType="begin"/>
-            </w:r>
-            <w:r>
-              <w:rPr>
-                <w:noProof/>
-              </w:rPr>
               <w:instrText xml:space="preserve"> PAGEREF _Toc233316908 \h </w:instrText>
-            </w:r>
-            <w:r>
-              <w:rPr>
-                <w:noProof/>
-              </w:rPr>
-            </w:r>
-            <w:r>
-              <w:rPr>
-                <w:noProof/>
-              </w:rPr>
               <w:fldChar w:fldCharType="separate"/>
-            </w:r>
-            <w:r>
-              <w:rPr>
-                <w:noProof/>
-              </w:rPr>
               <w:t>15</w:t>
-            </w:r>
-            <w:r>
-              <w:rPr>
-                <w:noProof/>
-              </w:rPr>
               <w:fldChar w:fldCharType="end"/>
             </w:r>
           </w:hyperlink>
@@ -2143,40 +1209,10 @@
                 <w:noProof/>
               </w:rPr>
               <w:tab/>
-            </w:r>
-            <w:r>
-              <w:rPr>
-                <w:noProof/>
-              </w:rPr>
               <w:fldChar w:fldCharType="begin"/>
-            </w:r>
-            <w:r>
-              <w:rPr>
-                <w:noProof/>
-              </w:rPr>
               <w:instrText xml:space="preserve"> PAGEREF _Toc233316909 \h </w:instrText>
-            </w:r>
-            <w:r>
-              <w:rPr>
-                <w:noProof/>
-              </w:rPr>
-            </w:r>
-            <w:r>
-              <w:rPr>
-                <w:noProof/>
-              </w:rPr>
               <w:fldChar w:fldCharType="separate"/>
-            </w:r>
-            <w:r>
-              <w:rPr>
-                <w:noProof/>
-              </w:rPr>
               <w:t>15</w:t>
-            </w:r>
-            <w:r>
-              <w:rPr>
-                <w:noProof/>
-              </w:rPr>
               <w:fldChar w:fldCharType="end"/>
             </w:r>
           </w:hyperlink>
@@ -2204,40 +1240,10 @@
                 <w:noProof/>
               </w:rPr>
               <w:tab/>
-            </w:r>
-            <w:r>
-              <w:rPr>
-                <w:noProof/>
-              </w:rPr>
               <w:fldChar w:fldCharType="begin"/>
-            </w:r>
-            <w:r>
-              <w:rPr>
-                <w:noProof/>
-              </w:rPr>
               <w:instrText xml:space="preserve"> PAGEREF _Toc233316910 \h </w:instrText>
-            </w:r>
-            <w:r>
-              <w:rPr>
-                <w:noProof/>
-              </w:rPr>
-            </w:r>
-            <w:r>
-              <w:rPr>
-                <w:noProof/>
-              </w:rPr>
               <w:fldChar w:fldCharType="separate"/>
-            </w:r>
-            <w:r>
-              <w:rPr>
-                <w:noProof/>
-              </w:rPr>
               <w:t>17</w:t>
-            </w:r>
-            <w:r>
-              <w:rPr>
-                <w:noProof/>
-              </w:rPr>
               <w:fldChar w:fldCharType="end"/>
             </w:r>
           </w:hyperlink>
@@ -2265,40 +1271,10 @@
                 <w:noProof/>
               </w:rPr>
               <w:tab/>
-            </w:r>
-            <w:r>
-              <w:rPr>
-                <w:noProof/>
-              </w:rPr>
               <w:fldChar w:fldCharType="begin"/>
-            </w:r>
-            <w:r>
-              <w:rPr>
-                <w:noProof/>
-              </w:rPr>
               <w:instrText xml:space="preserve"> PAGEREF _Toc233316911 \h </w:instrText>
-            </w:r>
-            <w:r>
-              <w:rPr>
-                <w:noProof/>
-              </w:rPr>
-            </w:r>
-            <w:r>
-              <w:rPr>
-                <w:noProof/>
-              </w:rPr>
               <w:fldChar w:fldCharType="separate"/>
-            </w:r>
-            <w:r>
-              <w:rPr>
-                <w:noProof/>
-              </w:rPr>
               <w:t>17</w:t>
-            </w:r>
-            <w:r>
-              <w:rPr>
-                <w:noProof/>
-              </w:rPr>
               <w:fldChar w:fldCharType="end"/>
             </w:r>
           </w:hyperlink>
@@ -2326,40 +1302,10 @@
                 <w:noProof/>
               </w:rPr>
               <w:tab/>
-            </w:r>
-            <w:r>
-              <w:rPr>
-                <w:noProof/>
-              </w:rPr>
               <w:fldChar w:fldCharType="begin"/>
-            </w:r>
-            <w:r>
-              <w:rPr>
-                <w:noProof/>
-              </w:rPr>
               <w:instrText xml:space="preserve"> PAGEREF _Toc233316912 \h </w:instrText>
-            </w:r>
-            <w:r>
-              <w:rPr>
-                <w:noProof/>
-              </w:rPr>
-            </w:r>
-            <w:r>
-              <w:rPr>
-                <w:noProof/>
-              </w:rPr>
               <w:fldChar w:fldCharType="separate"/>
-            </w:r>
-            <w:r>
-              <w:rPr>
-                <w:noProof/>
-              </w:rPr>
               <w:t>17</w:t>
-            </w:r>
-            <w:r>
-              <w:rPr>
-                <w:noProof/>
-              </w:rPr>
               <w:fldChar w:fldCharType="end"/>
             </w:r>
           </w:hyperlink>
@@ -2387,40 +1333,10 @@
                 <w:noProof/>
               </w:rPr>
               <w:tab/>
-            </w:r>
-            <w:r>
-              <w:rPr>
-                <w:noProof/>
-              </w:rPr>
               <w:fldChar w:fldCharType="begin"/>
-            </w:r>
-            <w:r>
-              <w:rPr>
-                <w:noProof/>
-              </w:rPr>
               <w:instrText xml:space="preserve"> PAGEREF _Toc233316913 \h </w:instrText>
-            </w:r>
-            <w:r>
-              <w:rPr>
-                <w:noProof/>
-              </w:rPr>
-            </w:r>
-            <w:r>
-              <w:rPr>
-                <w:noProof/>
-              </w:rPr>
               <w:fldChar w:fldCharType="separate"/>
-            </w:r>
-            <w:r>
-              <w:rPr>
-                <w:noProof/>
-              </w:rPr>
               <w:t>19</w:t>
-            </w:r>
-            <w:r>
-              <w:rPr>
-                <w:noProof/>
-              </w:rPr>
               <w:fldChar w:fldCharType="end"/>
             </w:r>
           </w:hyperlink>
@@ -2448,40 +1364,10 @@
                 <w:noProof/>
               </w:rPr>
               <w:tab/>
-            </w:r>
-            <w:r>
-              <w:rPr>
-                <w:noProof/>
-              </w:rPr>
               <w:fldChar w:fldCharType="begin"/>
-            </w:r>
-            <w:r>
-              <w:rPr>
-                <w:noProof/>
-              </w:rPr>
               <w:instrText xml:space="preserve"> PAGEREF _Toc233316914 \h </w:instrText>
-            </w:r>
-            <w:r>
-              <w:rPr>
-                <w:noProof/>
-              </w:rPr>
-            </w:r>
-            <w:r>
-              <w:rPr>
-                <w:noProof/>
-              </w:rPr>
               <w:fldChar w:fldCharType="separate"/>
-            </w:r>
-            <w:r>
-              <w:rPr>
-                <w:noProof/>
-              </w:rPr>
               <w:t>19</w:t>
-            </w:r>
-            <w:r>
-              <w:rPr>
-                <w:noProof/>
-              </w:rPr>
               <w:fldChar w:fldCharType="end"/>
             </w:r>
           </w:hyperlink>
@@ -2509,40 +1395,10 @@
                 <w:noProof/>
               </w:rPr>
               <w:tab/>
-            </w:r>
-            <w:r>
-              <w:rPr>
-                <w:noProof/>
-              </w:rPr>
               <w:fldChar w:fldCharType="begin"/>
-            </w:r>
-            <w:r>
-              <w:rPr>
-                <w:noProof/>
-              </w:rPr>
               <w:instrText xml:space="preserve"> PAGEREF _Toc233316915 \h </w:instrText>
-            </w:r>
-            <w:r>
-              <w:rPr>
-                <w:noProof/>
-              </w:rPr>
-            </w:r>
-            <w:r>
-              <w:rPr>
-                <w:noProof/>
-              </w:rPr>
               <w:fldChar w:fldCharType="separate"/>
-            </w:r>
-            <w:r>
-              <w:rPr>
-                <w:noProof/>
-              </w:rPr>
               <w:t>19</w:t>
-            </w:r>
-            <w:r>
-              <w:rPr>
-                <w:noProof/>
-              </w:rPr>
               <w:fldChar w:fldCharType="end"/>
             </w:r>
           </w:hyperlink>
@@ -2570,40 +1426,10 @@
                 <w:noProof/>
               </w:rPr>
               <w:tab/>
-            </w:r>
-            <w:r>
-              <w:rPr>
-                <w:noProof/>
-              </w:rPr>
               <w:fldChar w:fldCharType="begin"/>
-            </w:r>
-            <w:r>
-              <w:rPr>
-                <w:noProof/>
-              </w:rPr>
               <w:instrText xml:space="preserve"> PAGEREF _Toc233316916 \h </w:instrText>
-            </w:r>
-            <w:r>
-              <w:rPr>
-                <w:noProof/>
-              </w:rPr>
-            </w:r>
-            <w:r>
-              <w:rPr>
-                <w:noProof/>
-              </w:rPr>
               <w:fldChar w:fldCharType="separate"/>
-            </w:r>
-            <w:r>
-              <w:rPr>
-                <w:noProof/>
-              </w:rPr>
               <w:t>19</w:t>
-            </w:r>
-            <w:r>
-              <w:rPr>
-                <w:noProof/>
-              </w:rPr>
               <w:fldChar w:fldCharType="end"/>
             </w:r>
           </w:hyperlink>
@@ -2631,40 +1457,10 @@
                 <w:noProof/>
               </w:rPr>
               <w:tab/>
-            </w:r>
-            <w:r>
-              <w:rPr>
-                <w:noProof/>
-              </w:rPr>
               <w:fldChar w:fldCharType="begin"/>
-            </w:r>
-            <w:r>
-              <w:rPr>
-                <w:noProof/>
-              </w:rPr>
               <w:instrText xml:space="preserve"> PAGEREF _Toc233316917 \h </w:instrText>
-            </w:r>
-            <w:r>
-              <w:rPr>
-                <w:noProof/>
-              </w:rPr>
-            </w:r>
-            <w:r>
-              <w:rPr>
-                <w:noProof/>
-              </w:rPr>
               <w:fldChar w:fldCharType="separate"/>
-            </w:r>
-            <w:r>
-              <w:rPr>
-                <w:noProof/>
-              </w:rPr>
               <w:t>19</w:t>
-            </w:r>
-            <w:r>
-              <w:rPr>
-                <w:noProof/>
-              </w:rPr>
               <w:fldChar w:fldCharType="end"/>
             </w:r>
           </w:hyperlink>
@@ -2692,40 +1488,10 @@
                 <w:noProof/>
               </w:rPr>
               <w:tab/>
-            </w:r>
-            <w:r>
-              <w:rPr>
-                <w:noProof/>
-              </w:rPr>
               <w:fldChar w:fldCharType="begin"/>
-            </w:r>
-            <w:r>
-              <w:rPr>
-                <w:noProof/>
-              </w:rPr>
               <w:instrText xml:space="preserve"> PAGEREF _Toc233316918 \h </w:instrText>
-            </w:r>
-            <w:r>
-              <w:rPr>
-                <w:noProof/>
-              </w:rPr>
-            </w:r>
-            <w:r>
-              <w:rPr>
-                <w:noProof/>
-              </w:rPr>
               <w:fldChar w:fldCharType="separate"/>
-            </w:r>
-            <w:r>
-              <w:rPr>
-                <w:noProof/>
-              </w:rPr>
               <w:t>20</w:t>
-            </w:r>
-            <w:r>
-              <w:rPr>
-                <w:noProof/>
-              </w:rPr>
               <w:fldChar w:fldCharType="end"/>
             </w:r>
           </w:hyperlink>
@@ -2753,40 +1519,10 @@
                 <w:noProof/>
               </w:rPr>
               <w:tab/>
-            </w:r>
-            <w:r>
-              <w:rPr>
-                <w:noProof/>
-              </w:rPr>
               <w:fldChar w:fldCharType="begin"/>
-            </w:r>
-            <w:r>
-              <w:rPr>
-                <w:noProof/>
-              </w:rPr>
               <w:instrText xml:space="preserve"> PAGEREF _Toc233316919 \h </w:instrText>
-            </w:r>
-            <w:r>
-              <w:rPr>
-                <w:noProof/>
-              </w:rPr>
-            </w:r>
-            <w:r>
-              <w:rPr>
-                <w:noProof/>
-              </w:rPr>
               <w:fldChar w:fldCharType="separate"/>
-            </w:r>
-            <w:r>
-              <w:rPr>
-                <w:noProof/>
-              </w:rPr>
               <w:t>20</w:t>
-            </w:r>
-            <w:r>
-              <w:rPr>
-                <w:noProof/>
-              </w:rPr>
               <w:fldChar w:fldCharType="end"/>
             </w:r>
           </w:hyperlink>
@@ -2814,40 +1550,10 @@
                 <w:noProof/>
               </w:rPr>
               <w:tab/>
-            </w:r>
-            <w:r>
-              <w:rPr>
-                <w:noProof/>
-              </w:rPr>
               <w:fldChar w:fldCharType="begin"/>
-            </w:r>
-            <w:r>
-              <w:rPr>
-                <w:noProof/>
-              </w:rPr>
               <w:instrText xml:space="preserve"> PAGEREF _Toc233316920 \h </w:instrText>
-            </w:r>
-            <w:r>
-              <w:rPr>
-                <w:noProof/>
-              </w:rPr>
-            </w:r>
-            <w:r>
-              <w:rPr>
-                <w:noProof/>
-              </w:rPr>
               <w:fldChar w:fldCharType="separate"/>
-            </w:r>
-            <w:r>
-              <w:rPr>
-                <w:noProof/>
-              </w:rPr>
               <w:t>20</w:t>
-            </w:r>
-            <w:r>
-              <w:rPr>
-                <w:noProof/>
-              </w:rPr>
               <w:fldChar w:fldCharType="end"/>
             </w:r>
           </w:hyperlink>
@@ -2875,40 +1581,10 @@
                 <w:noProof/>
               </w:rPr>
               <w:tab/>
-            </w:r>
-            <w:r>
-              <w:rPr>
-                <w:noProof/>
-              </w:rPr>
               <w:fldChar w:fldCharType="begin"/>
-            </w:r>
-            <w:r>
-              <w:rPr>
-                <w:noProof/>
-              </w:rPr>
               <w:instrText xml:space="preserve"> PAGEREF _Toc233316921 \h </w:instrText>
-            </w:r>
-            <w:r>
-              <w:rPr>
-                <w:noProof/>
-              </w:rPr>
-            </w:r>
-            <w:r>
-              <w:rPr>
-                <w:noProof/>
-              </w:rPr>
               <w:fldChar w:fldCharType="separate"/>
-            </w:r>
-            <w:r>
-              <w:rPr>
-                <w:noProof/>
-              </w:rPr>
               <w:t>21</w:t>
-            </w:r>
-            <w:r>
-              <w:rPr>
-                <w:noProof/>
-              </w:rPr>
               <w:fldChar w:fldCharType="end"/>
             </w:r>
           </w:hyperlink>
@@ -2936,40 +1612,10 @@
                 <w:noProof/>
               </w:rPr>
               <w:tab/>
-            </w:r>
-            <w:r>
-              <w:rPr>
-                <w:noProof/>
-              </w:rPr>
               <w:fldChar w:fldCharType="begin"/>
-            </w:r>
-            <w:r>
-              <w:rPr>
-                <w:noProof/>
-              </w:rPr>
               <w:instrText xml:space="preserve"> PAGEREF _Toc233316922 \h </w:instrText>
-            </w:r>
-            <w:r>
-              <w:rPr>
-                <w:noProof/>
-              </w:rPr>
-            </w:r>
-            <w:r>
-              <w:rPr>
-                <w:noProof/>
-              </w:rPr>
               <w:fldChar w:fldCharType="separate"/>
-            </w:r>
-            <w:r>
-              <w:rPr>
-                <w:noProof/>
-              </w:rPr>
               <w:t>21</w:t>
-            </w:r>
-            <w:r>
-              <w:rPr>
-                <w:noProof/>
-              </w:rPr>
               <w:fldChar w:fldCharType="end"/>
             </w:r>
           </w:hyperlink>
@@ -2997,40 +1643,10 @@
                 <w:noProof/>
               </w:rPr>
               <w:tab/>
-            </w:r>
-            <w:r>
-              <w:rPr>
-                <w:noProof/>
-              </w:rPr>
               <w:fldChar w:fldCharType="begin"/>
-            </w:r>
-            <w:r>
-              <w:rPr>
-                <w:noProof/>
-              </w:rPr>
               <w:instrText xml:space="preserve"> PAGEREF _Toc233316923 \h </w:instrText>
-            </w:r>
-            <w:r>
-              <w:rPr>
-                <w:noProof/>
-              </w:rPr>
-            </w:r>
-            <w:r>
-              <w:rPr>
-                <w:noProof/>
-              </w:rPr>
               <w:fldChar w:fldCharType="separate"/>
-            </w:r>
-            <w:r>
-              <w:rPr>
-                <w:noProof/>
-              </w:rPr>
               <w:t>21</w:t>
-            </w:r>
-            <w:r>
-              <w:rPr>
-                <w:noProof/>
-              </w:rPr>
               <w:fldChar w:fldCharType="end"/>
             </w:r>
           </w:hyperlink>
@@ -3058,40 +1674,10 @@
                 <w:noProof/>
               </w:rPr>
               <w:tab/>
-            </w:r>
-            <w:r>
-              <w:rPr>
-                <w:noProof/>
-              </w:rPr>
               <w:fldChar w:fldCharType="begin"/>
-            </w:r>
-            <w:r>
-              <w:rPr>
-                <w:noProof/>
-              </w:rPr>
               <w:instrText xml:space="preserve"> PAGEREF _Toc233316924 \h </w:instrText>
-            </w:r>
-            <w:r>
-              <w:rPr>
-                <w:noProof/>
-              </w:rPr>
-            </w:r>
-            <w:r>
-              <w:rPr>
-                <w:noProof/>
-              </w:rPr>
               <w:fldChar w:fldCharType="separate"/>
-            </w:r>
-            <w:r>
-              <w:rPr>
-                <w:noProof/>
-              </w:rPr>
               <w:t>22</w:t>
-            </w:r>
-            <w:r>
-              <w:rPr>
-                <w:noProof/>
-              </w:rPr>
               <w:fldChar w:fldCharType="end"/>
             </w:r>
           </w:hyperlink>
@@ -3119,40 +1705,10 @@
                 <w:noProof/>
               </w:rPr>
               <w:tab/>
-            </w:r>
-            <w:r>
-              <w:rPr>
-                <w:noProof/>
-              </w:rPr>
               <w:fldChar w:fldCharType="begin"/>
-            </w:r>
-            <w:r>
-              <w:rPr>
-                <w:noProof/>
-              </w:rPr>
               <w:instrText xml:space="preserve"> PAGEREF _Toc233316925 \h </w:instrText>
-            </w:r>
-            <w:r>
-              <w:rPr>
-                <w:noProof/>
-              </w:rPr>
-            </w:r>
-            <w:r>
-              <w:rPr>
-                <w:noProof/>
-              </w:rPr>
               <w:fldChar w:fldCharType="separate"/>
-            </w:r>
-            <w:r>
-              <w:rPr>
-                <w:noProof/>
-              </w:rPr>
               <w:t>22</w:t>
-            </w:r>
-            <w:r>
-              <w:rPr>
-                <w:noProof/>
-              </w:rPr>
               <w:fldChar w:fldCharType="end"/>
             </w:r>
           </w:hyperlink>
@@ -3180,40 +1736,10 @@
                 <w:noProof/>
               </w:rPr>
               <w:tab/>
-            </w:r>
-            <w:r>
-              <w:rPr>
-                <w:noProof/>
-              </w:rPr>
               <w:fldChar w:fldCharType="begin"/>
-            </w:r>
-            <w:r>
-              <w:rPr>
-                <w:noProof/>
-              </w:rPr>
               <w:instrText xml:space="preserve"> PAGEREF _Toc233316926 \h </w:instrText>
-            </w:r>
-            <w:r>
-              <w:rPr>
-                <w:noProof/>
-              </w:rPr>
-            </w:r>
-            <w:r>
-              <w:rPr>
-                <w:noProof/>
-              </w:rPr>
               <w:fldChar w:fldCharType="separate"/>
-            </w:r>
-            <w:r>
-              <w:rPr>
-                <w:noProof/>
-              </w:rPr>
               <w:t>22</w:t>
-            </w:r>
-            <w:r>
-              <w:rPr>
-                <w:noProof/>
-              </w:rPr>
               <w:fldChar w:fldCharType="end"/>
             </w:r>
           </w:hyperlink>
@@ -3241,40 +1767,10 @@
                 <w:noProof/>
               </w:rPr>
               <w:tab/>
-            </w:r>
-            <w:r>
-              <w:rPr>
-                <w:noProof/>
-              </w:rPr>
               <w:fldChar w:fldCharType="begin"/>
-            </w:r>
-            <w:r>
-              <w:rPr>
-                <w:noProof/>
-              </w:rPr>
               <w:instrText xml:space="preserve"> PAGEREF _Toc233316927 \h </w:instrText>
-            </w:r>
-            <w:r>
-              <w:rPr>
-                <w:noProof/>
-              </w:rPr>
-            </w:r>
-            <w:r>
-              <w:rPr>
-                <w:noProof/>
-              </w:rPr>
               <w:fldChar w:fldCharType="separate"/>
-            </w:r>
-            <w:r>
-              <w:rPr>
-                <w:noProof/>
-              </w:rPr>
               <w:t>24</w:t>
-            </w:r>
-            <w:r>
-              <w:rPr>
-                <w:noProof/>
-              </w:rPr>
               <w:fldChar w:fldCharType="end"/>
             </w:r>
           </w:hyperlink>
@@ -3302,40 +1798,10 @@
                 <w:noProof/>
               </w:rPr>
               <w:tab/>
-            </w:r>
-            <w:r>
-              <w:rPr>
-                <w:noProof/>
-              </w:rPr>
               <w:fldChar w:fldCharType="begin"/>
-            </w:r>
-            <w:r>
-              <w:rPr>
-                <w:noProof/>
-              </w:rPr>
               <w:instrText xml:space="preserve"> PAGEREF _Toc233316928 \h </w:instrText>
-            </w:r>
-            <w:r>
-              <w:rPr>
-                <w:noProof/>
-              </w:rPr>
-            </w:r>
-            <w:r>
-              <w:rPr>
-                <w:noProof/>
-              </w:rPr>
               <w:fldChar w:fldCharType="separate"/>
-            </w:r>
-            <w:r>
-              <w:rPr>
-                <w:noProof/>
-              </w:rPr>
               <w:t>24</w:t>
-            </w:r>
-            <w:r>
-              <w:rPr>
-                <w:noProof/>
-              </w:rPr>
               <w:fldChar w:fldCharType="end"/>
             </w:r>
           </w:hyperlink>
@@ -3363,40 +1829,10 @@
                 <w:noProof/>
               </w:rPr>
               <w:tab/>
-            </w:r>
-            <w:r>
-              <w:rPr>
-                <w:noProof/>
-              </w:rPr>
               <w:fldChar w:fldCharType="begin"/>
-            </w:r>
-            <w:r>
-              <w:rPr>
-                <w:noProof/>
-              </w:rPr>
               <w:instrText xml:space="preserve"> PAGEREF _Toc233316929 \h </w:instrText>
-            </w:r>
-            <w:r>
-              <w:rPr>
-                <w:noProof/>
-              </w:rPr>
-            </w:r>
-            <w:r>
-              <w:rPr>
-                <w:noProof/>
-              </w:rPr>
               <w:fldChar w:fldCharType="separate"/>
-            </w:r>
-            <w:r>
-              <w:rPr>
-                <w:noProof/>
-              </w:rPr>
               <w:t>24</w:t>
-            </w:r>
-            <w:r>
-              <w:rPr>
-                <w:noProof/>
-              </w:rPr>
               <w:fldChar w:fldCharType="end"/>
             </w:r>
           </w:hyperlink>
@@ -3424,40 +1860,10 @@
                 <w:noProof/>
               </w:rPr>
               <w:tab/>
-            </w:r>
-            <w:r>
-              <w:rPr>
-                <w:noProof/>
-              </w:rPr>
               <w:fldChar w:fldCharType="begin"/>
-            </w:r>
-            <w:r>
-              <w:rPr>
-                <w:noProof/>
-              </w:rPr>
               <w:instrText xml:space="preserve"> PAGEREF _Toc233316930 \h </w:instrText>
-            </w:r>
-            <w:r>
-              <w:rPr>
-                <w:noProof/>
-              </w:rPr>
-            </w:r>
-            <w:r>
-              <w:rPr>
-                <w:noProof/>
-              </w:rPr>
               <w:fldChar w:fldCharType="separate"/>
-            </w:r>
-            <w:r>
-              <w:rPr>
-                <w:noProof/>
-              </w:rPr>
               <w:t>24</w:t>
-            </w:r>
-            <w:r>
-              <w:rPr>
-                <w:noProof/>
-              </w:rPr>
               <w:fldChar w:fldCharType="end"/>
             </w:r>
           </w:hyperlink>
@@ -3485,40 +1891,10 @@
                 <w:noProof/>
               </w:rPr>
               <w:tab/>
-            </w:r>
-            <w:r>
-              <w:rPr>
-                <w:noProof/>
-              </w:rPr>
               <w:fldChar w:fldCharType="begin"/>
-            </w:r>
-            <w:r>
-              <w:rPr>
-                <w:noProof/>
-              </w:rPr>
               <w:instrText xml:space="preserve"> PAGEREF _Toc233316931 \h </w:instrText>
-            </w:r>
-            <w:r>
-              <w:rPr>
-                <w:noProof/>
-              </w:rPr>
-            </w:r>
-            <w:r>
-              <w:rPr>
-                <w:noProof/>
-              </w:rPr>
               <w:fldChar w:fldCharType="separate"/>
-            </w:r>
-            <w:r>
-              <w:rPr>
-                <w:noProof/>
-              </w:rPr>
               <w:t>25</w:t>
-            </w:r>
-            <w:r>
-              <w:rPr>
-                <w:noProof/>
-              </w:rPr>
               <w:fldChar w:fldCharType="end"/>
             </w:r>
           </w:hyperlink>
@@ -3546,40 +1922,10 @@
                 <w:noProof/>
               </w:rPr>
               <w:tab/>
-            </w:r>
-            <w:r>
-              <w:rPr>
-                <w:noProof/>
-              </w:rPr>
               <w:fldChar w:fldCharType="begin"/>
-            </w:r>
-            <w:r>
-              <w:rPr>
-                <w:noProof/>
-              </w:rPr>
               <w:instrText xml:space="preserve"> PAGEREF _Toc233316932 \h </w:instrText>
-            </w:r>
-            <w:r>
-              <w:rPr>
-                <w:noProof/>
-              </w:rPr>
-            </w:r>
-            <w:r>
-              <w:rPr>
-                <w:noProof/>
-              </w:rPr>
               <w:fldChar w:fldCharType="separate"/>
-            </w:r>
-            <w:r>
-              <w:rPr>
-                <w:noProof/>
-              </w:rPr>
               <w:t>25</w:t>
-            </w:r>
-            <w:r>
-              <w:rPr>
-                <w:noProof/>
-              </w:rPr>
               <w:fldChar w:fldCharType="end"/>
             </w:r>
           </w:hyperlink>
@@ -3607,40 +1953,10 @@
                 <w:noProof/>
               </w:rPr>
               <w:tab/>
-            </w:r>
-            <w:r>
-              <w:rPr>
-                <w:noProof/>
-              </w:rPr>
               <w:fldChar w:fldCharType="begin"/>
-            </w:r>
-            <w:r>
-              <w:rPr>
-                <w:noProof/>
-              </w:rPr>
               <w:instrText xml:space="preserve"> PAGEREF _Toc233316933 \h </w:instrText>
-            </w:r>
-            <w:r>
-              <w:rPr>
-                <w:noProof/>
-              </w:rPr>
-            </w:r>
-            <w:r>
-              <w:rPr>
-                <w:noProof/>
-              </w:rPr>
               <w:fldChar w:fldCharType="separate"/>
-            </w:r>
-            <w:r>
-              <w:rPr>
-                <w:noProof/>
-              </w:rPr>
               <w:t>27</w:t>
-            </w:r>
-            <w:r>
-              <w:rPr>
-                <w:noProof/>
-              </w:rPr>
               <w:fldChar w:fldCharType="end"/>
             </w:r>
           </w:hyperlink>
@@ -3668,40 +1984,10 @@
                 <w:noProof/>
               </w:rPr>
               <w:tab/>
-            </w:r>
-            <w:r>
-              <w:rPr>
-                <w:noProof/>
-              </w:rPr>
               <w:fldChar w:fldCharType="begin"/>
-            </w:r>
-            <w:r>
-              <w:rPr>
-                <w:noProof/>
-              </w:rPr>
               <w:instrText xml:space="preserve"> PAGEREF _Toc233316934 \h </w:instrText>
-            </w:r>
-            <w:r>
-              <w:rPr>
-                <w:noProof/>
-              </w:rPr>
-            </w:r>
-            <w:r>
-              <w:rPr>
-                <w:noProof/>
-              </w:rPr>
               <w:fldChar w:fldCharType="separate"/>
-            </w:r>
-            <w:r>
-              <w:rPr>
-                <w:noProof/>
-              </w:rPr>
               <w:t>27</w:t>
-            </w:r>
-            <w:r>
-              <w:rPr>
-                <w:noProof/>
-              </w:rPr>
               <w:fldChar w:fldCharType="end"/>
             </w:r>
           </w:hyperlink>
@@ -3729,40 +2015,10 @@
                 <w:noProof/>
               </w:rPr>
               <w:tab/>
-            </w:r>
-            <w:r>
-              <w:rPr>
-                <w:noProof/>
-              </w:rPr>
               <w:fldChar w:fldCharType="begin"/>
-            </w:r>
-            <w:r>
-              <w:rPr>
-                <w:noProof/>
-              </w:rPr>
               <w:instrText xml:space="preserve"> PAGEREF _Toc233316935 \h </w:instrText>
-            </w:r>
-            <w:r>
-              <w:rPr>
-                <w:noProof/>
-              </w:rPr>
-            </w:r>
-            <w:r>
-              <w:rPr>
-                <w:noProof/>
-              </w:rPr>
               <w:fldChar w:fldCharType="separate"/>
-            </w:r>
-            <w:r>
-              <w:rPr>
-                <w:noProof/>
-              </w:rPr>
               <w:t>27</w:t>
-            </w:r>
-            <w:r>
-              <w:rPr>
-                <w:noProof/>
-              </w:rPr>
               <w:fldChar w:fldCharType="end"/>
             </w:r>
           </w:hyperlink>
@@ -3790,40 +2046,10 @@
                 <w:noProof/>
               </w:rPr>
               <w:tab/>
-            </w:r>
-            <w:r>
-              <w:rPr>
-                <w:noProof/>
-              </w:rPr>
               <w:fldChar w:fldCharType="begin"/>
-            </w:r>
-            <w:r>
-              <w:rPr>
-                <w:noProof/>
-              </w:rPr>
               <w:instrText xml:space="preserve"> PAGEREF _Toc233316936 \h </w:instrText>
-            </w:r>
-            <w:r>
-              <w:rPr>
-                <w:noProof/>
-              </w:rPr>
-            </w:r>
-            <w:r>
-              <w:rPr>
-                <w:noProof/>
-              </w:rPr>
               <w:fldChar w:fldCharType="separate"/>
-            </w:r>
-            <w:r>
-              <w:rPr>
-                <w:noProof/>
-              </w:rPr>
               <w:t>27</w:t>
-            </w:r>
-            <w:r>
-              <w:rPr>
-                <w:noProof/>
-              </w:rPr>
               <w:fldChar w:fldCharType="end"/>
             </w:r>
           </w:hyperlink>
@@ -3851,40 +2077,10 @@
                 <w:noProof/>
               </w:rPr>
               <w:tab/>
-            </w:r>
-            <w:r>
-              <w:rPr>
-                <w:noProof/>
-              </w:rPr>
               <w:fldChar w:fldCharType="begin"/>
-            </w:r>
-            <w:r>
-              <w:rPr>
-                <w:noProof/>
-              </w:rPr>
               <w:instrText xml:space="preserve"> PAGEREF _Toc233316937 \h </w:instrText>
-            </w:r>
-            <w:r>
-              <w:rPr>
-                <w:noProof/>
-              </w:rPr>
-            </w:r>
-            <w:r>
-              <w:rPr>
-                <w:noProof/>
-              </w:rPr>
               <w:fldChar w:fldCharType="separate"/>
-            </w:r>
-            <w:r>
-              <w:rPr>
-                <w:noProof/>
-              </w:rPr>
               <w:t>27</w:t>
-            </w:r>
-            <w:r>
-              <w:rPr>
-                <w:noProof/>
-              </w:rPr>
               <w:fldChar w:fldCharType="end"/>
             </w:r>
           </w:hyperlink>
@@ -3912,40 +2108,10 @@
                 <w:noProof/>
               </w:rPr>
               <w:tab/>
-            </w:r>
-            <w:r>
-              <w:rPr>
-                <w:noProof/>
-              </w:rPr>
               <w:fldChar w:fldCharType="begin"/>
-            </w:r>
-            <w:r>
-              <w:rPr>
-                <w:noProof/>
-              </w:rPr>
               <w:instrText xml:space="preserve"> PAGEREF _Toc233316938 \h </w:instrText>
-            </w:r>
-            <w:r>
-              <w:rPr>
-                <w:noProof/>
-              </w:rPr>
-            </w:r>
-            <w:r>
-              <w:rPr>
-                <w:noProof/>
-              </w:rPr>
               <w:fldChar w:fldCharType="separate"/>
-            </w:r>
-            <w:r>
-              <w:rPr>
-                <w:noProof/>
-              </w:rPr>
               <w:t>28</w:t>
-            </w:r>
-            <w:r>
-              <w:rPr>
-                <w:noProof/>
-              </w:rPr>
               <w:fldChar w:fldCharType="end"/>
             </w:r>
           </w:hyperlink>
@@ -3973,40 +2139,10 @@
                 <w:noProof/>
               </w:rPr>
               <w:tab/>
-            </w:r>
-            <w:r>
-              <w:rPr>
-                <w:noProof/>
-              </w:rPr>
               <w:fldChar w:fldCharType="begin"/>
-            </w:r>
-            <w:r>
-              <w:rPr>
-                <w:noProof/>
-              </w:rPr>
               <w:instrText xml:space="preserve"> PAGEREF _Toc233316939 \h </w:instrText>
-            </w:r>
-            <w:r>
-              <w:rPr>
-                <w:noProof/>
-              </w:rPr>
-            </w:r>
-            <w:r>
-              <w:rPr>
-                <w:noProof/>
-              </w:rPr>
               <w:fldChar w:fldCharType="separate"/>
-            </w:r>
-            <w:r>
-              <w:rPr>
-                <w:noProof/>
-              </w:rPr>
               <w:t>28</w:t>
-            </w:r>
-            <w:r>
-              <w:rPr>
-                <w:noProof/>
-              </w:rPr>
               <w:fldChar w:fldCharType="end"/>
             </w:r>
           </w:hyperlink>
@@ -4034,40 +2170,10 @@
                 <w:noProof/>
               </w:rPr>
               <w:tab/>
-            </w:r>
-            <w:r>
-              <w:rPr>
-                <w:noProof/>
-              </w:rPr>
               <w:fldChar w:fldCharType="begin"/>
-            </w:r>
-            <w:r>
-              <w:rPr>
-                <w:noProof/>
-              </w:rPr>
               <w:instrText xml:space="preserve"> PAGEREF _Toc233316940 \h </w:instrText>
-            </w:r>
-            <w:r>
-              <w:rPr>
-                <w:noProof/>
-              </w:rPr>
-            </w:r>
-            <w:r>
-              <w:rPr>
-                <w:noProof/>
-              </w:rPr>
               <w:fldChar w:fldCharType="separate"/>
-            </w:r>
-            <w:r>
-              <w:rPr>
-                <w:noProof/>
-              </w:rPr>
               <w:t>28</w:t>
-            </w:r>
-            <w:r>
-              <w:rPr>
-                <w:noProof/>
-              </w:rPr>
               <w:fldChar w:fldCharType="end"/>
             </w:r>
           </w:hyperlink>
@@ -4095,40 +2201,10 @@
                 <w:noProof/>
               </w:rPr>
               <w:tab/>
-            </w:r>
-            <w:r>
-              <w:rPr>
-                <w:noProof/>
-              </w:rPr>
               <w:fldChar w:fldCharType="begin"/>
-            </w:r>
-            <w:r>
-              <w:rPr>
-                <w:noProof/>
-              </w:rPr>
               <w:instrText xml:space="preserve"> PAGEREF _Toc233316941 \h </w:instrText>
-            </w:r>
-            <w:r>
-              <w:rPr>
-                <w:noProof/>
-              </w:rPr>
-            </w:r>
-            <w:r>
-              <w:rPr>
-                <w:noProof/>
-              </w:rPr>
               <w:fldChar w:fldCharType="separate"/>
-            </w:r>
-            <w:r>
-              <w:rPr>
-                <w:noProof/>
-              </w:rPr>
               <w:t>29</w:t>
-            </w:r>
-            <w:r>
-              <w:rPr>
-                <w:noProof/>
-              </w:rPr>
               <w:fldChar w:fldCharType="end"/>
             </w:r>
           </w:hyperlink>
@@ -4156,40 +2232,10 @@
                 <w:noProof/>
               </w:rPr>
               <w:tab/>
-            </w:r>
-            <w:r>
-              <w:rPr>
-                <w:noProof/>
-              </w:rPr>
               <w:fldChar w:fldCharType="begin"/>
-            </w:r>
-            <w:r>
-              <w:rPr>
-                <w:noProof/>
-              </w:rPr>
               <w:instrText xml:space="preserve"> PAGEREF _Toc233316942 \h </w:instrText>
-            </w:r>
-            <w:r>
-              <w:rPr>
-                <w:noProof/>
-              </w:rPr>
-            </w:r>
-            <w:r>
-              <w:rPr>
-                <w:noProof/>
-              </w:rPr>
               <w:fldChar w:fldCharType="separate"/>
-            </w:r>
-            <w:r>
-              <w:rPr>
-                <w:noProof/>
-              </w:rPr>
               <w:t>29</w:t>
-            </w:r>
-            <w:r>
-              <w:rPr>
-                <w:noProof/>
-              </w:rPr>
               <w:fldChar w:fldCharType="end"/>
             </w:r>
           </w:hyperlink>
@@ -4217,40 +2263,10 @@
                 <w:noProof/>
               </w:rPr>
               <w:tab/>
-            </w:r>
-            <w:r>
-              <w:rPr>
-                <w:noProof/>
-              </w:rPr>
               <w:fldChar w:fldCharType="begin"/>
-            </w:r>
-            <w:r>
-              <w:rPr>
-                <w:noProof/>
-              </w:rPr>
               <w:instrText xml:space="preserve"> PAGEREF _Toc233316943 \h </w:instrText>
-            </w:r>
-            <w:r>
-              <w:rPr>
-                <w:noProof/>
-              </w:rPr>
-            </w:r>
-            <w:r>
-              <w:rPr>
-                <w:noProof/>
-              </w:rPr>
               <w:fldChar w:fldCharType="separate"/>
-            </w:r>
-            <w:r>
-              <w:rPr>
-                <w:noProof/>
-              </w:rPr>
               <w:t>29</w:t>
-            </w:r>
-            <w:r>
-              <w:rPr>
-                <w:noProof/>
-              </w:rPr>
               <w:fldChar w:fldCharType="end"/>
             </w:r>
           </w:hyperlink>
@@ -4278,40 +2294,10 @@
                 <w:noProof/>
               </w:rPr>
               <w:tab/>
-            </w:r>
-            <w:r>
-              <w:rPr>
-                <w:noProof/>
-              </w:rPr>
               <w:fldChar w:fldCharType="begin"/>
-            </w:r>
-            <w:r>
-              <w:rPr>
-                <w:noProof/>
-              </w:rPr>
               <w:instrText xml:space="preserve"> PAGEREF _Toc233316944 \h </w:instrText>
-            </w:r>
-            <w:r>
-              <w:rPr>
-                <w:noProof/>
-              </w:rPr>
-            </w:r>
-            <w:r>
-              <w:rPr>
-                <w:noProof/>
-              </w:rPr>
               <w:fldChar w:fldCharType="separate"/>
-            </w:r>
-            <w:r>
-              <w:rPr>
-                <w:noProof/>
-              </w:rPr>
               <w:t>29</w:t>
-            </w:r>
-            <w:r>
-              <w:rPr>
-                <w:noProof/>
-              </w:rPr>
               <w:fldChar w:fldCharType="end"/>
             </w:r>
           </w:hyperlink>
@@ -4339,40 +2325,10 @@
                 <w:noProof/>
               </w:rPr>
               <w:tab/>
-            </w:r>
-            <w:r>
-              <w:rPr>
-                <w:noProof/>
-              </w:rPr>
               <w:fldChar w:fldCharType="begin"/>
-            </w:r>
-            <w:r>
-              <w:rPr>
-                <w:noProof/>
-              </w:rPr>
               <w:instrText xml:space="preserve"> PAGEREF _Toc233316945 \h </w:instrText>
-            </w:r>
-            <w:r>
-              <w:rPr>
-                <w:noProof/>
-              </w:rPr>
-            </w:r>
-            <w:r>
-              <w:rPr>
-                <w:noProof/>
-              </w:rPr>
               <w:fldChar w:fldCharType="separate"/>
-            </w:r>
-            <w:r>
-              <w:rPr>
-                <w:noProof/>
-              </w:rPr>
               <w:t>29</w:t>
-            </w:r>
-            <w:r>
-              <w:rPr>
-                <w:noProof/>
-              </w:rPr>
               <w:fldChar w:fldCharType="end"/>
             </w:r>
           </w:hyperlink>
@@ -4400,40 +2356,10 @@
                 <w:noProof/>
               </w:rPr>
               <w:tab/>
-            </w:r>
-            <w:r>
-              <w:rPr>
-                <w:noProof/>
-              </w:rPr>
               <w:fldChar w:fldCharType="begin"/>
-            </w:r>
-            <w:r>
-              <w:rPr>
-                <w:noProof/>
-              </w:rPr>
               <w:instrText xml:space="preserve"> PAGEREF _Toc233316946 \h </w:instrText>
-            </w:r>
-            <w:r>
-              <w:rPr>
-                <w:noProof/>
-              </w:rPr>
-            </w:r>
-            <w:r>
-              <w:rPr>
-                <w:noProof/>
-              </w:rPr>
               <w:fldChar w:fldCharType="separate"/>
-            </w:r>
-            <w:r>
-              <w:rPr>
-                <w:noProof/>
-              </w:rPr>
               <w:t>30</w:t>
-            </w:r>
-            <w:r>
-              <w:rPr>
-                <w:noProof/>
-              </w:rPr>
               <w:fldChar w:fldCharType="end"/>
             </w:r>
           </w:hyperlink>
@@ -4461,40 +2387,10 @@
                 <w:noProof/>
               </w:rPr>
               <w:tab/>
-            </w:r>
-            <w:r>
-              <w:rPr>
-                <w:noProof/>
-              </w:rPr>
               <w:fldChar w:fldCharType="begin"/>
-            </w:r>
-            <w:r>
-              <w:rPr>
-                <w:noProof/>
-              </w:rPr>
               <w:instrText xml:space="preserve"> PAGEREF _Toc233316947 \h </w:instrText>
-            </w:r>
-            <w:r>
-              <w:rPr>
-                <w:noProof/>
-              </w:rPr>
-            </w:r>
-            <w:r>
-              <w:rPr>
-                <w:noProof/>
-              </w:rPr>
               <w:fldChar w:fldCharType="separate"/>
-            </w:r>
-            <w:r>
-              <w:rPr>
-                <w:noProof/>
-              </w:rPr>
               <w:t>31</w:t>
-            </w:r>
-            <w:r>
-              <w:rPr>
-                <w:noProof/>
-              </w:rPr>
               <w:fldChar w:fldCharType="end"/>
             </w:r>
           </w:hyperlink>
@@ -4522,40 +2418,10 @@
                 <w:noProof/>
               </w:rPr>
               <w:tab/>
-            </w:r>
-            <w:r>
-              <w:rPr>
-                <w:noProof/>
-              </w:rPr>
               <w:fldChar w:fldCharType="begin"/>
-            </w:r>
-            <w:r>
-              <w:rPr>
-                <w:noProof/>
-              </w:rPr>
               <w:instrText xml:space="preserve"> PAGEREF _Toc233316948 \h </w:instrText>
-            </w:r>
-            <w:r>
-              <w:rPr>
-                <w:noProof/>
-              </w:rPr>
-            </w:r>
-            <w:r>
-              <w:rPr>
-                <w:noProof/>
-              </w:rPr>
               <w:fldChar w:fldCharType="separate"/>
-            </w:r>
-            <w:r>
-              <w:rPr>
-                <w:noProof/>
-              </w:rPr>
               <w:t>31</w:t>
-            </w:r>
-            <w:r>
-              <w:rPr>
-                <w:noProof/>
-              </w:rPr>
               <w:fldChar w:fldCharType="end"/>
             </w:r>
           </w:hyperlink>
@@ -4583,40 +2449,10 @@
                 <w:noProof/>
               </w:rPr>
               <w:tab/>
-            </w:r>
-            <w:r>
-              <w:rPr>
-                <w:noProof/>
-              </w:rPr>
               <w:fldChar w:fldCharType="begin"/>
-            </w:r>
-            <w:r>
-              <w:rPr>
-                <w:noProof/>
-              </w:rPr>
               <w:instrText xml:space="preserve"> PAGEREF _Toc233316949 \h </w:instrText>
-            </w:r>
-            <w:r>
-              <w:rPr>
-                <w:noProof/>
-              </w:rPr>
-            </w:r>
-            <w:r>
-              <w:rPr>
-                <w:noProof/>
-              </w:rPr>
               <w:fldChar w:fldCharType="separate"/>
-            </w:r>
-            <w:r>
-              <w:rPr>
-                <w:noProof/>
-              </w:rPr>
               <w:t>31</w:t>
-            </w:r>
-            <w:r>
-              <w:rPr>
-                <w:noProof/>
-              </w:rPr>
               <w:fldChar w:fldCharType="end"/>
             </w:r>
           </w:hyperlink>
@@ -4644,40 +2480,10 @@
                 <w:noProof/>
               </w:rPr>
               <w:tab/>
-            </w:r>
-            <w:r>
-              <w:rPr>
-                <w:noProof/>
-              </w:rPr>
               <w:fldChar w:fldCharType="begin"/>
-            </w:r>
-            <w:r>
-              <w:rPr>
-                <w:noProof/>
-              </w:rPr>
               <w:instrText xml:space="preserve"> PAGEREF _Toc233316950 \h </w:instrText>
-            </w:r>
-            <w:r>
-              <w:rPr>
-                <w:noProof/>
-              </w:rPr>
-            </w:r>
-            <w:r>
-              <w:rPr>
-                <w:noProof/>
-              </w:rPr>
               <w:fldChar w:fldCharType="separate"/>
-            </w:r>
-            <w:r>
-              <w:rPr>
-                <w:noProof/>
-              </w:rPr>
               <w:t>31</w:t>
-            </w:r>
-            <w:r>
-              <w:rPr>
-                <w:noProof/>
-              </w:rPr>
               <w:fldChar w:fldCharType="end"/>
             </w:r>
           </w:hyperlink>
@@ -4705,40 +2511,10 @@
                 <w:noProof/>
               </w:rPr>
               <w:tab/>
-            </w:r>
-            <w:r>
-              <w:rPr>
-                <w:noProof/>
-              </w:rPr>
               <w:fldChar w:fldCharType="begin"/>
-            </w:r>
-            <w:r>
-              <w:rPr>
-                <w:noProof/>
-              </w:rPr>
               <w:instrText xml:space="preserve"> PAGEREF _Toc233316951 \h </w:instrText>
-            </w:r>
-            <w:r>
-              <w:rPr>
-                <w:noProof/>
-              </w:rPr>
-            </w:r>
-            <w:r>
-              <w:rPr>
-                <w:noProof/>
-              </w:rPr>
               <w:fldChar w:fldCharType="separate"/>
-            </w:r>
-            <w:r>
-              <w:rPr>
-                <w:noProof/>
-              </w:rPr>
               <w:t>32</w:t>
-            </w:r>
-            <w:r>
-              <w:rPr>
-                <w:noProof/>
-              </w:rPr>
               <w:fldChar w:fldCharType="end"/>
             </w:r>
           </w:hyperlink>
@@ -4766,40 +2542,10 @@
                 <w:noProof/>
               </w:rPr>
               <w:tab/>
-            </w:r>
-            <w:r>
-              <w:rPr>
-                <w:noProof/>
-              </w:rPr>
               <w:fldChar w:fldCharType="begin"/>
-            </w:r>
-            <w:r>
-              <w:rPr>
-                <w:noProof/>
-              </w:rPr>
               <w:instrText xml:space="preserve"> PAGEREF _Toc233316952 \h </w:instrText>
-            </w:r>
-            <w:r>
-              <w:rPr>
-                <w:noProof/>
-              </w:rPr>
-            </w:r>
-            <w:r>
-              <w:rPr>
-                <w:noProof/>
-              </w:rPr>
               <w:fldChar w:fldCharType="separate"/>
-            </w:r>
-            <w:r>
-              <w:rPr>
-                <w:noProof/>
-              </w:rPr>
               <w:t>32</w:t>
-            </w:r>
-            <w:r>
-              <w:rPr>
-                <w:noProof/>
-              </w:rPr>
               <w:fldChar w:fldCharType="end"/>
             </w:r>
           </w:hyperlink>
@@ -4827,40 +2573,10 @@
                 <w:noProof/>
               </w:rPr>
               <w:tab/>
-            </w:r>
-            <w:r>
-              <w:rPr>
-                <w:noProof/>
-              </w:rPr>
               <w:fldChar w:fldCharType="begin"/>
-            </w:r>
-            <w:r>
-              <w:rPr>
-                <w:noProof/>
-              </w:rPr>
               <w:instrText xml:space="preserve"> PAGEREF _Toc233316953 \h </w:instrText>
-            </w:r>
-            <w:r>
-              <w:rPr>
-                <w:noProof/>
-              </w:rPr>
-            </w:r>
-            <w:r>
-              <w:rPr>
-                <w:noProof/>
-              </w:rPr>
               <w:fldChar w:fldCharType="separate"/>
-            </w:r>
-            <w:r>
-              <w:rPr>
-                <w:noProof/>
-              </w:rPr>
               <w:t>32</w:t>
-            </w:r>
-            <w:r>
-              <w:rPr>
-                <w:noProof/>
-              </w:rPr>
               <w:fldChar w:fldCharType="end"/>
             </w:r>
           </w:hyperlink>
@@ -4888,40 +2604,10 @@
                 <w:noProof/>
               </w:rPr>
               <w:tab/>
-            </w:r>
-            <w:r>
-              <w:rPr>
-                <w:noProof/>
-              </w:rPr>
               <w:fldChar w:fldCharType="begin"/>
-            </w:r>
-            <w:r>
-              <w:rPr>
-                <w:noProof/>
-              </w:rPr>
               <w:instrText xml:space="preserve"> PAGEREF _Toc233316954 \h </w:instrText>
-            </w:r>
-            <w:r>
-              <w:rPr>
-                <w:noProof/>
-              </w:rPr>
-            </w:r>
-            <w:r>
-              <w:rPr>
-                <w:noProof/>
-              </w:rPr>
               <w:fldChar w:fldCharType="separate"/>
-            </w:r>
-            <w:r>
-              <w:rPr>
-                <w:noProof/>
-              </w:rPr>
               <w:t>32</w:t>
-            </w:r>
-            <w:r>
-              <w:rPr>
-                <w:noProof/>
-              </w:rPr>
               <w:fldChar w:fldCharType="end"/>
             </w:r>
           </w:hyperlink>
@@ -4949,40 +2635,10 @@
                 <w:noProof/>
               </w:rPr>
               <w:tab/>
-            </w:r>
-            <w:r>
-              <w:rPr>
-                <w:noProof/>
-              </w:rPr>
               <w:fldChar w:fldCharType="begin"/>
-            </w:r>
-            <w:r>
-              <w:rPr>
-                <w:noProof/>
-              </w:rPr>
               <w:instrText xml:space="preserve"> PAGEREF _Toc233316955 \h </w:instrText>
-            </w:r>
-            <w:r>
-              <w:rPr>
-                <w:noProof/>
-              </w:rPr>
-            </w:r>
-            <w:r>
-              <w:rPr>
-                <w:noProof/>
-              </w:rPr>
               <w:fldChar w:fldCharType="separate"/>
-            </w:r>
-            <w:r>
-              <w:rPr>
-                <w:noProof/>
-              </w:rPr>
               <w:t>32</w:t>
-            </w:r>
-            <w:r>
-              <w:rPr>
-                <w:noProof/>
-              </w:rPr>
               <w:fldChar w:fldCharType="end"/>
             </w:r>
           </w:hyperlink>
@@ -5010,40 +2666,10 @@
                 <w:noProof/>
               </w:rPr>
               <w:tab/>
-            </w:r>
-            <w:r>
-              <w:rPr>
-                <w:noProof/>
-              </w:rPr>
               <w:fldChar w:fldCharType="begin"/>
-            </w:r>
-            <w:r>
-              <w:rPr>
-                <w:noProof/>
-              </w:rPr>
               <w:instrText xml:space="preserve"> PAGEREF _Toc233316956 \h </w:instrText>
-            </w:r>
-            <w:r>
-              <w:rPr>
-                <w:noProof/>
-              </w:rPr>
-            </w:r>
-            <w:r>
-              <w:rPr>
-                <w:noProof/>
-              </w:rPr>
               <w:fldChar w:fldCharType="separate"/>
-            </w:r>
-            <w:r>
-              <w:rPr>
-                <w:noProof/>
-              </w:rPr>
               <w:t>32</w:t>
-            </w:r>
-            <w:r>
-              <w:rPr>
-                <w:noProof/>
-              </w:rPr>
               <w:fldChar w:fldCharType="end"/>
             </w:r>
           </w:hyperlink>
@@ -5071,40 +2697,10 @@
                 <w:noProof/>
               </w:rPr>
               <w:tab/>
-            </w:r>
-            <w:r>
-              <w:rPr>
-                <w:noProof/>
-              </w:rPr>
               <w:fldChar w:fldCharType="begin"/>
-            </w:r>
-            <w:r>
-              <w:rPr>
-                <w:noProof/>
-              </w:rPr>
               <w:instrText xml:space="preserve"> PAGEREF _Toc233316957 \h </w:instrText>
-            </w:r>
-            <w:r>
-              <w:rPr>
-                <w:noProof/>
-              </w:rPr>
-            </w:r>
-            <w:r>
-              <w:rPr>
-                <w:noProof/>
-              </w:rPr>
               <w:fldChar w:fldCharType="separate"/>
-            </w:r>
-            <w:r>
-              <w:rPr>
-                <w:noProof/>
-              </w:rPr>
               <w:t>32</w:t>
-            </w:r>
-            <w:r>
-              <w:rPr>
-                <w:noProof/>
-              </w:rPr>
               <w:fldChar w:fldCharType="end"/>
             </w:r>
           </w:hyperlink>
@@ -5132,40 +2728,10 @@
                 <w:noProof/>
               </w:rPr>
               <w:tab/>
-            </w:r>
-            <w:r>
-              <w:rPr>
-                <w:noProof/>
-              </w:rPr>
               <w:fldChar w:fldCharType="begin"/>
-            </w:r>
-            <w:r>
-              <w:rPr>
-                <w:noProof/>
-              </w:rPr>
               <w:instrText xml:space="preserve"> PAGEREF _Toc233316958 \h </w:instrText>
-            </w:r>
-            <w:r>
-              <w:rPr>
-                <w:noProof/>
-              </w:rPr>
-            </w:r>
-            <w:r>
-              <w:rPr>
-                <w:noProof/>
-              </w:rPr>
               <w:fldChar w:fldCharType="separate"/>
-            </w:r>
-            <w:r>
-              <w:rPr>
-                <w:noProof/>
-              </w:rPr>
               <w:t>32</w:t>
-            </w:r>
-            <w:r>
-              <w:rPr>
-                <w:noProof/>
-              </w:rPr>
               <w:fldChar w:fldCharType="end"/>
             </w:r>
           </w:hyperlink>
@@ -5193,40 +2759,10 @@
                 <w:noProof/>
               </w:rPr>
               <w:tab/>
-            </w:r>
-            <w:r>
-              <w:rPr>
-                <w:noProof/>
-              </w:rPr>
               <w:fldChar w:fldCharType="begin"/>
-            </w:r>
-            <w:r>
-              <w:rPr>
-                <w:noProof/>
-              </w:rPr>
               <w:instrText xml:space="preserve"> PAGEREF _Toc233316959 \h </w:instrText>
-            </w:r>
-            <w:r>
-              <w:rPr>
-                <w:noProof/>
-              </w:rPr>
-            </w:r>
-            <w:r>
-              <w:rPr>
-                <w:noProof/>
-              </w:rPr>
               <w:fldChar w:fldCharType="separate"/>
-            </w:r>
-            <w:r>
-              <w:rPr>
-                <w:noProof/>
-              </w:rPr>
               <w:t>33</w:t>
-            </w:r>
-            <w:r>
-              <w:rPr>
-                <w:noProof/>
-              </w:rPr>
               <w:fldChar w:fldCharType="end"/>
             </w:r>
           </w:hyperlink>
@@ -5254,40 +2790,10 @@
                 <w:noProof/>
               </w:rPr>
               <w:tab/>
-            </w:r>
-            <w:r>
-              <w:rPr>
-                <w:noProof/>
-              </w:rPr>
               <w:fldChar w:fldCharType="begin"/>
-            </w:r>
-            <w:r>
-              <w:rPr>
-                <w:noProof/>
-              </w:rPr>
               <w:instrText xml:space="preserve"> PAGEREF _Toc233316960 \h </w:instrText>
-            </w:r>
-            <w:r>
-              <w:rPr>
-                <w:noProof/>
-              </w:rPr>
-            </w:r>
-            <w:r>
-              <w:rPr>
-                <w:noProof/>
-              </w:rPr>
               <w:fldChar w:fldCharType="separate"/>
-            </w:r>
-            <w:r>
-              <w:rPr>
-                <w:noProof/>
-              </w:rPr>
               <w:t>33</w:t>
-            </w:r>
-            <w:r>
-              <w:rPr>
-                <w:noProof/>
-              </w:rPr>
               <w:fldChar w:fldCharType="end"/>
             </w:r>
           </w:hyperlink>
@@ -5315,40 +2821,10 @@
                 <w:noProof/>
               </w:rPr>
               <w:tab/>
-            </w:r>
-            <w:r>
-              <w:rPr>
-                <w:noProof/>
-              </w:rPr>
               <w:fldChar w:fldCharType="begin"/>
-            </w:r>
-            <w:r>
-              <w:rPr>
-                <w:noProof/>
-              </w:rPr>
               <w:instrText xml:space="preserve"> PAGEREF _Toc233316961 \h </w:instrText>
-            </w:r>
-            <w:r>
-              <w:rPr>
-                <w:noProof/>
-              </w:rPr>
-            </w:r>
-            <w:r>
-              <w:rPr>
-                <w:noProof/>
-              </w:rPr>
               <w:fldChar w:fldCharType="separate"/>
-            </w:r>
-            <w:r>
-              <w:rPr>
-                <w:noProof/>
-              </w:rPr>
               <w:t>33</w:t>
-            </w:r>
-            <w:r>
-              <w:rPr>
-                <w:noProof/>
-              </w:rPr>
               <w:fldChar w:fldCharType="end"/>
             </w:r>
           </w:hyperlink>
@@ -5376,40 +2852,10 @@
                 <w:noProof/>
               </w:rPr>
               <w:tab/>
-            </w:r>
-            <w:r>
-              <w:rPr>
-                <w:noProof/>
-              </w:rPr>
               <w:fldChar w:fldCharType="begin"/>
-            </w:r>
-            <w:r>
-              <w:rPr>
-                <w:noProof/>
-              </w:rPr>
               <w:instrText xml:space="preserve"> PAGEREF _Toc233316962 \h </w:instrText>
-            </w:r>
-            <w:r>
-              <w:rPr>
-                <w:noProof/>
-              </w:rPr>
-            </w:r>
-            <w:r>
-              <w:rPr>
-                <w:noProof/>
-              </w:rPr>
               <w:fldChar w:fldCharType="separate"/>
-            </w:r>
-            <w:r>
-              <w:rPr>
-                <w:noProof/>
-              </w:rPr>
               <w:t>33</w:t>
-            </w:r>
-            <w:r>
-              <w:rPr>
-                <w:noProof/>
-              </w:rPr>
               <w:fldChar w:fldCharType="end"/>
             </w:r>
           </w:hyperlink>
@@ -5437,40 +2883,10 @@
                 <w:noProof/>
               </w:rPr>
               <w:tab/>
-            </w:r>
-            <w:r>
-              <w:rPr>
-                <w:noProof/>
-              </w:rPr>
               <w:fldChar w:fldCharType="begin"/>
-            </w:r>
-            <w:r>
-              <w:rPr>
-                <w:noProof/>
-              </w:rPr>
               <w:instrText xml:space="preserve"> PAGEREF _Toc233316963 \h </w:instrText>
-            </w:r>
-            <w:r>
-              <w:rPr>
-                <w:noProof/>
-              </w:rPr>
-            </w:r>
-            <w:r>
-              <w:rPr>
-                <w:noProof/>
-              </w:rPr>
               <w:fldChar w:fldCharType="separate"/>
-            </w:r>
-            <w:r>
-              <w:rPr>
-                <w:noProof/>
-              </w:rPr>
               <w:t>33</w:t>
-            </w:r>
-            <w:r>
-              <w:rPr>
-                <w:noProof/>
-              </w:rPr>
               <w:fldChar w:fldCharType="end"/>
             </w:r>
           </w:hyperlink>
@@ -5498,40 +2914,10 @@
                 <w:noProof/>
               </w:rPr>
               <w:tab/>
-            </w:r>
-            <w:r>
-              <w:rPr>
-                <w:noProof/>
-              </w:rPr>
               <w:fldChar w:fldCharType="begin"/>
-            </w:r>
-            <w:r>
-              <w:rPr>
-                <w:noProof/>
-              </w:rPr>
               <w:instrText xml:space="preserve"> PAGEREF _Toc233316964 \h </w:instrText>
-            </w:r>
-            <w:r>
-              <w:rPr>
-                <w:noProof/>
-              </w:rPr>
-            </w:r>
-            <w:r>
-              <w:rPr>
-                <w:noProof/>
-              </w:rPr>
               <w:fldChar w:fldCharType="separate"/>
-            </w:r>
-            <w:r>
-              <w:rPr>
-                <w:noProof/>
-              </w:rPr>
               <w:t>33</w:t>
-            </w:r>
-            <w:r>
-              <w:rPr>
-                <w:noProof/>
-              </w:rPr>
               <w:fldChar w:fldCharType="end"/>
             </w:r>
           </w:hyperlink>
@@ -5559,40 +2945,10 @@
                 <w:noProof/>
               </w:rPr>
               <w:tab/>
-            </w:r>
-            <w:r>
-              <w:rPr>
-                <w:noProof/>
-              </w:rPr>
               <w:fldChar w:fldCharType="begin"/>
-            </w:r>
-            <w:r>
-              <w:rPr>
-                <w:noProof/>
-              </w:rPr>
               <w:instrText xml:space="preserve"> PAGEREF _Toc233316965 \h </w:instrText>
-            </w:r>
-            <w:r>
-              <w:rPr>
-                <w:noProof/>
-              </w:rPr>
-            </w:r>
-            <w:r>
-              <w:rPr>
-                <w:noProof/>
-              </w:rPr>
               <w:fldChar w:fldCharType="separate"/>
-            </w:r>
-            <w:r>
-              <w:rPr>
-                <w:noProof/>
-              </w:rPr>
               <w:t>34</w:t>
-            </w:r>
-            <w:r>
-              <w:rPr>
-                <w:noProof/>
-              </w:rPr>
               <w:fldChar w:fldCharType="end"/>
             </w:r>
           </w:hyperlink>
@@ -5620,40 +2976,10 @@
                 <w:noProof/>
               </w:rPr>
               <w:tab/>
-            </w:r>
-            <w:r>
-              <w:rPr>
-                <w:noProof/>
-              </w:rPr>
               <w:fldChar w:fldCharType="begin"/>
-            </w:r>
-            <w:r>
-              <w:rPr>
-                <w:noProof/>
-              </w:rPr>
               <w:instrText xml:space="preserve"> PAGEREF _Toc233316966 \h </w:instrText>
-            </w:r>
-            <w:r>
-              <w:rPr>
-                <w:noProof/>
-              </w:rPr>
-            </w:r>
-            <w:r>
-              <w:rPr>
-                <w:noProof/>
-              </w:rPr>
               <w:fldChar w:fldCharType="separate"/>
-            </w:r>
-            <w:r>
-              <w:rPr>
-                <w:noProof/>
-              </w:rPr>
               <w:t>35</w:t>
-            </w:r>
-            <w:r>
-              <w:rPr>
-                <w:noProof/>
-              </w:rPr>
               <w:fldChar w:fldCharType="end"/>
             </w:r>
           </w:hyperlink>
@@ -5681,40 +3007,10 @@
                 <w:noProof/>
               </w:rPr>
               <w:tab/>
-            </w:r>
-            <w:r>
-              <w:rPr>
-                <w:noProof/>
-              </w:rPr>
               <w:fldChar w:fldCharType="begin"/>
-            </w:r>
-            <w:r>
-              <w:rPr>
-                <w:noProof/>
-              </w:rPr>
               <w:instrText xml:space="preserve"> PAGEREF _Toc233316967 \h </w:instrText>
-            </w:r>
-            <w:r>
-              <w:rPr>
-                <w:noProof/>
-              </w:rPr>
-            </w:r>
-            <w:r>
-              <w:rPr>
-                <w:noProof/>
-              </w:rPr>
               <w:fldChar w:fldCharType="separate"/>
-            </w:r>
-            <w:r>
-              <w:rPr>
-                <w:noProof/>
-              </w:rPr>
               <w:t>35</w:t>
-            </w:r>
-            <w:r>
-              <w:rPr>
-                <w:noProof/>
-              </w:rPr>
               <w:fldChar w:fldCharType="end"/>
             </w:r>
           </w:hyperlink>
@@ -5742,40 +3038,10 @@
                 <w:noProof/>
               </w:rPr>
               <w:tab/>
-            </w:r>
-            <w:r>
-              <w:rPr>
-                <w:noProof/>
-              </w:rPr>
               <w:fldChar w:fldCharType="begin"/>
-            </w:r>
-            <w:r>
-              <w:rPr>
-                <w:noProof/>
-              </w:rPr>
               <w:instrText xml:space="preserve"> PAGEREF _Toc233316968 \h </w:instrText>
-            </w:r>
-            <w:r>
-              <w:rPr>
-                <w:noProof/>
-              </w:rPr>
-            </w:r>
-            <w:r>
-              <w:rPr>
-                <w:noProof/>
-              </w:rPr>
               <w:fldChar w:fldCharType="separate"/>
-            </w:r>
-            <w:r>
-              <w:rPr>
-                <w:noProof/>
-              </w:rPr>
               <w:t>35</w:t>
-            </w:r>
-            <w:r>
-              <w:rPr>
-                <w:noProof/>
-              </w:rPr>
               <w:fldChar w:fldCharType="end"/>
             </w:r>
           </w:hyperlink>
@@ -6382,13 +3648,7 @@
       </w:pPr>
       <w:r>
         <w:lastRenderedPageBreak/>
-        <w:t xml:space="preserve">All </w:t>
-      </w:r>
-      <w:r>
-        <w:t xml:space="preserve">design </w:t>
-      </w:r>
-      <w:r>
-        <w:t>staff are assigned to one of three teams: 3D, 2D, or Technical. Team assignment determines which projects appear in a designer's and team lead's dashboard, and which designers can be assigned to deliverables.</w:t>
+        <w:t>All design staff are assigned to one of three teams: 3D, 2D, or Technical. Team assignment determines which projects appear in a designer's and team lead's dashboard, and which designers can be assigned to deliverables.</w:t>
       </w:r>
     </w:p>
     <w:p>
@@ -10533,11 +7793,7 @@
       </w:r>
       <w:r>
         <w:t>Next step is that I can click “mark as resolved”, it moves to resolved status and gets closed. It then goes into bug fix history on the same page.</w:t>
-      </w:r>
-      <w:r>
         <w:br/>
-      </w:r>
-      <w:r>
         <w:br/>
       </w:r>
       <w:r>
@@ -11827,7 +9083,7 @@
                 <w:sz w:val="20"/>
                 <w:szCs w:val="20"/>
               </w:rPr>
-              <w:t>projects</w:t>
+              <w:t>brief</w:t>
             </w:r>
           </w:p>
         </w:tc>
@@ -11854,7 +9110,175 @@
                 <w:sz w:val="20"/>
                 <w:szCs w:val="20"/>
               </w:rPr>
-              <w:t>app/routes/projects.py — /projects/* (all project CRUD, submission, approval, files)</w:t>
+              <w:t>app/routes/projects_brief.py — create, edit, update, autosave, drafts, deliverable types</w:t>
+            </w:r>
+          </w:p>
+        </w:tc>
+      </w:tr>
+      <w:tr>
+        <w:tc>
+          <w:tcPr>
+            <w:tcW w:w="3000" w:type="dxa"/>
+            <w:tcBorders>
+              <w:top w:val="single" w:sz="1" w:space="0" w:color="CCCCCC"/>
+              <w:left w:val="single" w:sz="1" w:space="0" w:color="CCCCCC"/>
+              <w:bottom w:val="single" w:sz="1" w:space="0" w:color="CCCCCC"/>
+              <w:right w:val="single" w:sz="1" w:space="0" w:color="CCCCCC"/>
+            </w:tcBorders>
+            <w:shd w:val="clear" w:color="auto" w:fill="F0F0F0"/>
+            <w:tcMar>
+              <w:top w:w="80" w:type="dxa"/>
+              <w:left w:w="120" w:type="dxa"/>
+              <w:bottom w:w="80" w:type="dxa"/>
+              <w:right w:w="120" w:type="dxa"/>
+            </w:tcMar>
+          </w:tcPr>
+          <w:p>
+            <w:r>
+              <w:rPr>
+                <w:sz w:val="20"/>
+                <w:szCs w:val="20"/>
+              </w:rPr>
+              <w:t>project_detail</w:t>
+            </w:r>
+          </w:p>
+        </w:tc>
+        <w:tc>
+          <w:tcPr>
+            <w:tcW w:w="6026" w:type="dxa"/>
+            <w:tcBorders>
+              <w:top w:val="single" w:sz="1" w:space="0" w:color="CCCCCC"/>
+              <w:left w:val="single" w:sz="1" w:space="0" w:color="CCCCCC"/>
+              <w:bottom w:val="single" w:sz="1" w:space="0" w:color="CCCCCC"/>
+              <w:right w:val="single" w:sz="1" w:space="0" w:color="CCCCCC"/>
+            </w:tcBorders>
+            <w:shd w:val="clear" w:color="auto" w:fill="F0F0F0"/>
+            <w:tcMar>
+              <w:top w:w="80" w:type="dxa"/>
+              <w:left w:w="120" w:type="dxa"/>
+              <w:bottom w:w="80" w:type="dxa"/>
+              <w:right w:w="120" w:type="dxa"/>
+            </w:tcMar>
+          </w:tcPr>
+          <w:p>
+            <w:r>
+              <w:rPr>
+                <w:sz w:val="20"/>
+                <w:szCs w:val="20"/>
+              </w:rPr>
+              <w:t>app/routes/projects_detail.py — detail view, status, customers, deliverables, flags, assignments, files</w:t>
+            </w:r>
+          </w:p>
+        </w:tc>
+      </w:tr>
+      <w:tr>
+        <w:tc>
+          <w:tcPr>
+            <w:tcW w:w="3000" w:type="dxa"/>
+            <w:tcBorders>
+              <w:top w:val="single" w:sz="1" w:space="0" w:color="CCCCCC"/>
+              <w:left w:val="single" w:sz="1" w:space="0" w:color="CCCCCC"/>
+              <w:bottom w:val="single" w:sz="1" w:space="0" w:color="CCCCCC"/>
+              <w:right w:val="single" w:sz="1" w:space="0" w:color="CCCCCC"/>
+            </w:tcBorders>
+            <w:shd w:val="clear" w:color="auto" w:fill="FFFFFF"/>
+            <w:tcMar>
+              <w:top w:w="80" w:type="dxa"/>
+              <w:left w:w="120" w:type="dxa"/>
+              <w:bottom w:w="80" w:type="dxa"/>
+              <w:right w:w="120" w:type="dxa"/>
+            </w:tcMar>
+          </w:tcPr>
+          <w:p>
+            <w:r>
+              <w:rPr>
+                <w:sz w:val="20"/>
+                <w:szCs w:val="20"/>
+              </w:rPr>
+              <w:t>submission</w:t>
+            </w:r>
+          </w:p>
+        </w:tc>
+        <w:tc>
+          <w:tcPr>
+            <w:tcW w:w="6026" w:type="dxa"/>
+            <w:tcBorders>
+              <w:top w:val="single" w:sz="1" w:space="0" w:color="CCCCCC"/>
+              <w:left w:val="single" w:sz="1" w:space="0" w:color="CCCCCC"/>
+              <w:bottom w:val="single" w:sz="1" w:space="0" w:color="CCCCCC"/>
+              <w:right w:val="single" w:sz="1" w:space="0" w:color="CCCCCC"/>
+            </w:tcBorders>
+            <w:shd w:val="clear" w:color="auto" w:fill="FFFFFF"/>
+            <w:tcMar>
+              <w:top w:w="80" w:type="dxa"/>
+              <w:left w:w="120" w:type="dxa"/>
+              <w:bottom w:w="80" w:type="dxa"/>
+              <w:right w:w="120" w:type="dxa"/>
+            </w:tcMar>
+          </w:tcPr>
+          <w:p>
+            <w:r>
+              <w:rPr>
+                <w:sz w:val="20"/>
+                <w:szCs w:val="20"/>
+              </w:rPr>
+              <w:t>app/routes/projects_submission.py — submit brief, deck upload, internal review, submit-to-client, revision pipeline</w:t>
+            </w:r>
+          </w:p>
+        </w:tc>
+      </w:tr>
+      <w:tr>
+        <w:tc>
+          <w:tcPr>
+            <w:tcW w:w="3000" w:type="dxa"/>
+            <w:tcBorders>
+              <w:top w:val="single" w:sz="1" w:space="0" w:color="CCCCCC"/>
+              <w:left w:val="single" w:sz="1" w:space="0" w:color="CCCCCC"/>
+              <w:bottom w:val="single" w:sz="1" w:space="0" w:color="CCCCCC"/>
+              <w:right w:val="single" w:sz="1" w:space="0" w:color="CCCCCC"/>
+            </w:tcBorders>
+            <w:shd w:val="clear" w:color="auto" w:fill="F0F0F0"/>
+            <w:tcMar>
+              <w:top w:w="80" w:type="dxa"/>
+              <w:left w:w="120" w:type="dxa"/>
+              <w:bottom w:w="80" w:type="dxa"/>
+              <w:right w:w="120" w:type="dxa"/>
+            </w:tcMar>
+          </w:tcPr>
+          <w:p>
+            <w:r>
+              <w:rPr>
+                <w:sz w:val="20"/>
+                <w:szCs w:val="20"/>
+              </w:rPr>
+              <w:t>approval</w:t>
+            </w:r>
+          </w:p>
+        </w:tc>
+        <w:tc>
+          <w:tcPr>
+            <w:tcW w:w="6026" w:type="dxa"/>
+            <w:tcBorders>
+              <w:top w:val="single" w:sz="1" w:space="0" w:color="CCCCCC"/>
+              <w:left w:val="single" w:sz="1" w:space="0" w:color="CCCCCC"/>
+              <w:bottom w:val="single" w:sz="1" w:space="0" w:color="CCCCCC"/>
+              <w:right w:val="single" w:sz="1" w:space="0" w:color="CCCCCC"/>
+            </w:tcBorders>
+            <w:shd w:val="clear" w:color="auto" w:fill="F0F0F0"/>
+            <w:tcMar>
+              <w:top w:w="80" w:type="dxa"/>
+              <w:left w:w="120" w:type="dxa"/>
+              <w:bottom w:w="80" w:type="dxa"/>
+              <w:right w:w="120" w:type="dxa"/>
+            </w:tcMar>
+          </w:tcPr>
+          <w:p>
+            <w:r>
+              <w:rPr>
+                <w:sz w:val="20"/>
+                <w:szCs w:val="20"/>
+              </w:rPr>
+              <w:t>app/routes/projects_approval.py — approve submission (POSM + standard), approve concept &amp; KV</w:t>
             </w:r>
           </w:p>
         </w:tc>
@@ -13405,7 +10829,10 @@
                 <w:sz w:val="18"/>
                 <w:szCs w:val="18"/>
               </w:rPr>
-              <w:t xml:space="preserve">    projects.py               # projects blueprint — all project routes</w:t>
+              <w:t xml:space="preserve">    projects_brief.py         # brief blueprint — create, edit, update, autosave, drafts
+    projects_detail.py        # project_detail blueprint — detail view, status, customers, deliverables, flags, assignments
+    projects_submission.py    # submission blueprint — submit brief, deck upload/review/revision pipeline
+    projects_approval.py      # approval blueprint — approve submission, approve concept &amp; KV</w:t>
             </w:r>
           </w:p>
           <w:p>

</xml_diff>